<commit_message>
﻿Make invoice/quote templates printer-friendly
- White header (no dark band); light logo variant with dark FERRION
  wordmark on white, dark title text, gold accents only as thin rules
- Gesamtbetrag row uses gold fill (was dark) with black text
- Footer moved to a real Word page footer at the bottom of the page
  (gold top rule + light legal text), removed the dark inline footer band
- Add scripts/assets/ferrion-logo-light.png; regenerate both templates

Co-Authored-By: Claude Opus 4.8 <noreply@anthropic.com>
</commit_message>
<xml_diff>
--- a/templates/Ferrion-Angebotsvorlage.docx
+++ b/templates/Ferrion-Angebotsvorlage.docx
@@ -28,11 +28,10 @@
               <w:bottom w:val="none" w:color="FFFFFF" w:sz="0"/>
               <w:right w:val="none" w:color="FFFFFF" w:sz="0"/>
             </w:tcBorders>
-            <w:shd w:fill="0D1117" w:color="auto" w:val="clear"/>
-            <w:tcMar>
-              <w:top w:type="dxa" w:w="240"/>
-              <w:left w:type="dxa" w:w="240"/>
-              <w:bottom w:type="dxa" w:w="240"/>
+            <w:tcMar>
+              <w:top w:type="dxa" w:w="120"/>
+              <w:left w:type="dxa" w:w="0"/>
+              <w:bottom w:type="dxa" w:w="120"/>
               <w:right w:type="dxa" w:w="120"/>
             </w:tcMar>
             <w:vAlign w:val="center"/>
@@ -57,7 +56,7 @@
                           </pic:cNvPicPr>
                         </pic:nvPicPr>
                         <pic:blipFill>
-                          <a:blip r:embed="rId7" cstate="none"/>
+                          <a:blip r:embed="rId8" cstate="none"/>
                           <a:srcRect/>
                           <a:stretch>
                             <a:fillRect/>
@@ -86,7 +85,7 @@
             <w:r>
               <w:rPr>
                 <w:rFonts w:ascii="Arial" w:cs="Arial" w:eastAsia="Arial" w:hAnsi="Arial"/>
-                <w:color w:val="C9A84C"/>
+                <w:color w:val="6B7280"/>
                 <w:spacing w:val="30"/>
                 <w:sz w:val="12"/>
                 <w:szCs w:val="12"/>
@@ -104,12 +103,11 @@
               <w:bottom w:val="none" w:color="FFFFFF" w:sz="0"/>
               <w:right w:val="none" w:color="FFFFFF" w:sz="0"/>
             </w:tcBorders>
-            <w:shd w:fill="0D1117" w:color="auto" w:val="clear"/>
-            <w:tcMar>
-              <w:top w:type="dxa" w:w="260"/>
+            <w:tcMar>
+              <w:top w:type="dxa" w:w="120"/>
               <w:left w:type="dxa" w:w="120"/>
-              <w:bottom w:type="dxa" w:w="240"/>
-              <w:right w:type="dxa" w:w="260"/>
+              <w:bottom w:type="dxa" w:w="120"/>
+              <w:right w:type="dxa" w:w="0"/>
             </w:tcMar>
             <w:vAlign w:val="center"/>
           </w:tcPr>
@@ -122,7 +120,7 @@
                 <w:rFonts w:ascii="Arial" w:cs="Arial" w:eastAsia="Arial" w:hAnsi="Arial"/>
                 <w:b/>
                 <w:bCs/>
-                <w:color w:val="FFFFFF"/>
+                <w:color w:val="111827"/>
                 <w:spacing w:val="30"/>
                 <w:sz w:val="40"/>
                 <w:szCs w:val="40"/>
@@ -1194,7 +1192,7 @@
                 <w:rFonts w:ascii="Arial" w:cs="Arial" w:eastAsia="Arial" w:hAnsi="Arial"/>
                 <w:b w:val="false"/>
                 <w:bCs w:val="false"/>
-                <w:color w:val="111827"/>
+                <w:color w:val="000000"/>
                 <w:sz w:val="17"/>
                 <w:szCs w:val="17"/>
               </w:rPr>
@@ -1281,7 +1279,7 @@
                 <w:rFonts w:ascii="Arial" w:cs="Arial" w:eastAsia="Arial" w:hAnsi="Arial"/>
                 <w:b w:val="false"/>
                 <w:bCs w:val="false"/>
-                <w:color w:val="111827"/>
+                <w:color w:val="000000"/>
                 <w:sz w:val="17"/>
                 <w:szCs w:val="17"/>
               </w:rPr>
@@ -1319,7 +1317,7 @@
               <w:bottom w:val="none" w:color="FFFFFF" w:sz="0"/>
               <w:right w:val="none" w:color="FFFFFF" w:sz="0"/>
             </w:tcBorders>
-            <w:shd w:fill="0D1117" w:color="auto" w:val="clear"/>
+            <w:shd w:fill="C9A84C" w:color="auto" w:val="clear"/>
             <w:tcMar>
               <w:top w:type="dxa" w:w="60"/>
               <w:left w:type="dxa" w:w="120"/>
@@ -1336,7 +1334,7 @@
                 <w:rFonts w:ascii="Arial" w:cs="Arial" w:eastAsia="Arial" w:hAnsi="Arial"/>
                 <w:b/>
                 <w:bCs/>
-                <w:color w:val="FFFFFF"/>
+                <w:color w:val="000000"/>
                 <w:sz w:val="18"/>
                 <w:szCs w:val="18"/>
               </w:rPr>
@@ -1353,7 +1351,7 @@
               <w:bottom w:val="none" w:color="FFFFFF" w:sz="0"/>
               <w:right w:val="none" w:color="FFFFFF" w:sz="0"/>
             </w:tcBorders>
-            <w:shd w:fill="0D1117" w:color="auto" w:val="clear"/>
+            <w:shd w:fill="C9A84C" w:color="auto" w:val="clear"/>
             <w:tcMar>
               <w:top w:type="dxa" w:w="60"/>
               <w:left w:type="dxa" w:w="120"/>
@@ -1370,7 +1368,7 @@
                 <w:rFonts w:ascii="Arial" w:cs="Arial" w:eastAsia="Arial" w:hAnsi="Arial"/>
                 <w:b/>
                 <w:bCs/>
-                <w:color w:val="C9A84C"/>
+                <w:color w:val="000000"/>
                 <w:sz w:val="20"/>
                 <w:szCs w:val="20"/>
               </w:rPr>
@@ -1459,7 +1457,7 @@
     </w:tbl>
     <w:p>
       <w:pPr>
-        <w:spacing w:after="200" w:before="480"/>
+        <w:spacing w:after="120" w:before="480"/>
         <w:jc w:val="center"/>
       </w:pPr>
       <w:r>
@@ -1474,101 +1472,9 @@
         <w:t xml:space="preserve">Wir freuen uns auf Ihre Beauftragung.</w:t>
       </w:r>
     </w:p>
-    <w:tbl>
-      <w:tblPr>
-        <w:tblW w:type="dxa" w:w="9638"/>
-        <w:tblBorders>
-          <w:top w:val="none" w:color="FFFFFF" w:sz="0"/>
-          <w:left w:val="none" w:color="FFFFFF" w:sz="0"/>
-          <w:bottom w:val="none" w:color="FFFFFF" w:sz="0"/>
-          <w:right w:val="none" w:color="FFFFFF" w:sz="0"/>
-          <w:insideH w:val="single" w:color="auto" w:sz="4"/>
-          <w:insideV w:val="single" w:color="auto" w:sz="4"/>
-        </w:tblBorders>
-      </w:tblPr>
-      <w:tblGrid>
-        <w:gridCol w:w="9638"/>
-      </w:tblGrid>
-      <w:tr>
-        <w:tc>
-          <w:tcPr>
-            <w:tcW w:type="dxa" w:w="9638"/>
-            <w:tcBorders>
-              <w:top w:val="none" w:color="FFFFFF" w:sz="0"/>
-              <w:left w:val="none" w:color="FFFFFF" w:sz="0"/>
-              <w:bottom w:val="none" w:color="FFFFFF" w:sz="0"/>
-              <w:right w:val="none" w:color="FFFFFF" w:sz="0"/>
-            </w:tcBorders>
-            <w:shd w:fill="0D1117" w:color="auto" w:val="clear"/>
-            <w:tcMar>
-              <w:top w:type="dxa" w:w="200"/>
-              <w:left w:type="dxa" w:w="240"/>
-              <w:bottom w:type="dxa" w:w="200"/>
-              <w:right w:type="dxa" w:w="240"/>
-            </w:tcMar>
-          </w:tcPr>
-          <w:p>
-            <w:r>
-              <w:rPr>
-                <w:rFonts w:ascii="Arial" w:cs="Arial" w:eastAsia="Arial" w:hAnsi="Arial"/>
-                <w:b/>
-                <w:bCs/>
-                <w:color w:val="C9A84C"/>
-                <w:sz w:val="14"/>
-                <w:szCs w:val="14"/>
-              </w:rPr>
-              <w:t xml:space="preserve">Ferrion IT Systemhaus GmbH</w:t>
-            </w:r>
-          </w:p>
-          <w:p>
-            <w:pPr>
-              <w:spacing w:before="30"/>
-            </w:pPr>
-            <w:r>
-              <w:rPr>
-                <w:rFonts w:ascii="Arial" w:cs="Arial" w:eastAsia="Arial" w:hAnsi="Arial"/>
-                <w:color w:val="9CA3AF"/>
-                <w:sz w:val="13"/>
-                <w:szCs w:val="13"/>
-              </w:rPr>
-              <w:t xml:space="preserve">{issuer_street}, {issuer_zip_city}, Österreich · info@ferrion.at · ferrion.at</w:t>
-            </w:r>
-          </w:p>
-          <w:p>
-            <w:pPr>
-              <w:spacing w:before="20"/>
-            </w:pPr>
-            <w:r>
-              <w:rPr>
-                <w:rFonts w:ascii="Arial" w:cs="Arial" w:eastAsia="Arial" w:hAnsi="Arial"/>
-                <w:color w:val="9CA3AF"/>
-                <w:sz w:val="13"/>
-                <w:szCs w:val="13"/>
-              </w:rPr>
-              <w:t xml:space="preserve">Firmenbuch: {issuer_firmenbuch} · {issuer_court} · UID: {issuer_uid} · IBAN: {issuer_iban}</w:t>
-            </w:r>
-          </w:p>
-          <w:p>
-            <w:pPr>
-              <w:spacing w:before="30"/>
-            </w:pPr>
-            <w:r>
-              <w:rPr>
-                <w:rFonts w:ascii="Arial" w:cs="Arial" w:eastAsia="Arial" w:hAnsi="Arial"/>
-                <w:color w:val="C9A84C"/>
-                <w:spacing w:val="40"/>
-                <w:sz w:val="12"/>
-                <w:szCs w:val="12"/>
-              </w:rPr>
-              <w:t xml:space="preserve">build to endure</w:t>
-            </w:r>
-          </w:p>
-        </w:tc>
-      </w:tr>
-    </w:tbl>
     <w:p>
       <w:pPr>
-        <w:spacing w:before="160"/>
+        <w:spacing w:before="40"/>
         <w:jc w:val="center"/>
       </w:pPr>
       <w:r>
@@ -1584,8 +1490,9 @@
       </w:r>
     </w:p>
     <w:sectPr>
+      <w:footerReference w:type="default" r:id="rId7"/>
       <w:pgSz w:w="11906" w:h="16838" w:orient="portrait"/>
-      <w:pgMar w:top="1134" w:right="1134" w:bottom="900" w:left="1134" w:header="708" w:footer="708" w:gutter="0"/>
+      <w:pgMar w:top="1134" w:right="1134" w:bottom="1440" w:left="1134" w:header="708" w:footer="560" w:gutter="0"/>
       <w:pgNumType/>
       <w:docGrid w:linePitch="360"/>
     </w:sectPr>
@@ -1632,6 +1539,76 @@
     </w:p>
   </w:endnote>
 </w:endnotes>
+</file>
+
+<file path=word/footer1.xml><?xml version="1.0" encoding="utf-8"?>
+<w:ftr xmlns:wpc="http://schemas.microsoft.com/office/word/2010/wordprocessingCanvas" xmlns:mc="http://schemas.openxmlformats.org/markup-compatibility/2006" xmlns:o="urn:schemas-microsoft-com:office:office" xmlns:r="http://schemas.openxmlformats.org/officeDocument/2006/relationships" xmlns:m="http://schemas.openxmlformats.org/officeDocument/2006/math" xmlns:v="urn:schemas-microsoft-com:vml" xmlns:wp14="http://schemas.microsoft.com/office/word/2010/wordprocessingDrawing" xmlns:wp="http://schemas.openxmlformats.org/drawingml/2006/wordprocessingDrawing" xmlns:w10="urn:schemas-microsoft-com:office:word" xmlns:w="http://schemas.openxmlformats.org/wordprocessingml/2006/main" xmlns:w14="http://schemas.microsoft.com/office/word/2010/wordml" xmlns:w15="http://schemas.microsoft.com/office/word/2012/wordml" xmlns:wpg="http://schemas.microsoft.com/office/word/2010/wordprocessingGroup" xmlns:wpi="http://schemas.microsoft.com/office/word/2010/wordprocessingInk" xmlns:wne="http://schemas.microsoft.com/office/word/2006/wordml" xmlns:wps="http://schemas.microsoft.com/office/word/2010/wordprocessingShape">
+  <w:p>
+    <w:pPr>
+      <w:pBdr>
+        <w:top w:val="single" w:color="C9A84C" w:sz="8" w:space="8"/>
+      </w:pBdr>
+      <w:spacing w:after="20" w:before="40"/>
+      <w:jc w:val="center"/>
+    </w:pPr>
+    <w:r>
+      <w:rPr>
+        <w:rFonts w:ascii="Arial" w:cs="Arial" w:eastAsia="Arial" w:hAnsi="Arial"/>
+        <w:b/>
+        <w:bCs/>
+        <w:color w:val="111827"/>
+        <w:sz w:val="13"/>
+        <w:szCs w:val="13"/>
+      </w:rPr>
+      <w:t xml:space="preserve">Ferrion IT Systemhaus GmbH</w:t>
+    </w:r>
+  </w:p>
+  <w:p>
+    <w:pPr>
+      <w:jc w:val="center"/>
+    </w:pPr>
+    <w:r>
+      <w:rPr>
+        <w:rFonts w:ascii="Arial" w:cs="Arial" w:eastAsia="Arial" w:hAnsi="Arial"/>
+        <w:color w:val="6B7280"/>
+        <w:sz w:val="12"/>
+        <w:szCs w:val="12"/>
+      </w:rPr>
+      <w:t xml:space="preserve">{issuer_street}, {issuer_zip_city}, Österreich · info@ferrion.at · ferrion.at</w:t>
+    </w:r>
+  </w:p>
+  <w:p>
+    <w:pPr>
+      <w:spacing w:before="10"/>
+      <w:jc w:val="center"/>
+    </w:pPr>
+    <w:r>
+      <w:rPr>
+        <w:rFonts w:ascii="Arial" w:cs="Arial" w:eastAsia="Arial" w:hAnsi="Arial"/>
+        <w:color w:val="6B7280"/>
+        <w:sz w:val="12"/>
+        <w:szCs w:val="12"/>
+      </w:rPr>
+      <w:t xml:space="preserve">Firmenbuch: {issuer_firmenbuch} · {issuer_court} · UID: {issuer_uid} · IBAN: {issuer_iban}</w:t>
+    </w:r>
+  </w:p>
+  <w:p>
+    <w:pPr>
+      <w:spacing w:before="20"/>
+      <w:jc w:val="center"/>
+    </w:pPr>
+    <w:r>
+      <w:rPr>
+        <w:rFonts w:ascii="Arial" w:cs="Arial" w:eastAsia="Arial" w:hAnsi="Arial"/>
+        <w:color w:val="C9A84C"/>
+        <w:spacing w:val="40"/>
+        <w:sz w:val="11"/>
+        <w:szCs w:val="11"/>
+      </w:rPr>
+      <w:t xml:space="preserve">build to endure</w:t>
+    </w:r>
+  </w:p>
+</w:ftr>
 </file>
 
 <file path=word/footnotes.xml><?xml version="1.0" encoding="utf-8"?>

</xml_diff>

<commit_message>
﻿Expand quote template into a full multi-page offer document
The Angebotsvorlage now contains the requested legal structure with
example texts: Praeambel, Angebotsdaten & Preise, Leistungsbeschreibung,
Allgemeine Bestimmungen (3.1 Ruecktrittsrecht, 3.2 Gewaehrleistung,
3.3 Haftung, 3.4 Urheberrecht, 3.5 Loyalitaet, 3.6 Datenschutz),
Auftragsverarbeitungsvereinbarung (4.1-4.7), Gerichtsstand (6),
Schlussbestimmungen (7) and Auftragserteilung (8) with a signature area
and an electronic-order note to order@ferrion.at.

- Section/subsection/body/bullet helpers + signature block in the generator
- Quote branch uses the new quoteBody(); invoice stays the compact layout
- Legal texts are clearly marked as non-binding sample texts
- CI guide updated (documents section) and date bumped

Co-Authored-By: Claude Opus 4.8 <noreply@anthropic.com>
</commit_message>
<xml_diff>
--- a/templates/Ferrion-Angebotsvorlage.docx
+++ b/templates/Ferrion-Angebotsvorlage.docx
@@ -721,13 +721,87 @@
     </w:p>
     <w:p>
       <w:pPr>
-        <w:spacing w:after="160"/>
-      </w:pPr>
-      <w:r>
-        <w:rPr>
-          <w:rFonts w:ascii="Arial" w:cs="Arial" w:eastAsia="Arial" w:hAnsi="Arial"/>
-        </w:rPr>
-        <w:t xml:space="preserve"/>
+        <w:pBdr>
+          <w:bottom w:val="single" w:color="C9A84C" w:sz="8" w:space="6"/>
+        </w:pBdr>
+        <w:spacing w:after="100" w:before="340"/>
+      </w:pPr>
+      <w:r>
+        <w:rPr>
+          <w:rFonts w:ascii="Arial" w:cs="Arial" w:eastAsia="Arial" w:hAnsi="Arial"/>
+          <w:b/>
+          <w:bCs/>
+          <w:color w:val="111827"/>
+          <w:spacing w:val="8"/>
+          <w:sz w:val="21"/>
+          <w:szCs w:val="21"/>
+        </w:rPr>
+        <w:t xml:space="preserve">PRÄAMBEL</w:t>
+      </w:r>
+    </w:p>
+    <w:p>
+      <w:pPr>
+        <w:spacing w:after="70"/>
+        <w:jc w:val="both"/>
+      </w:pPr>
+      <w:r>
+        <w:rPr>
+          <w:rFonts w:ascii="Arial" w:cs="Arial" w:eastAsia="Arial" w:hAnsi="Arial"/>
+          <w:color w:val="374151"/>
+          <w:sz w:val="16"/>
+          <w:szCs w:val="16"/>
+        </w:rPr>
+        <w:t xml:space="preserve">Ferrion IT Systemhaus GmbH (nachfolgend „Auftragnehmer“) erbringt Leistungen in den Bereichen IT-Infrastruktur, Storage, Backup &amp; Security, AI-Infrastruktur sowie Managed Services. Das vorliegende Angebot richtet sich an {customer_company} (nachfolgend „Auftraggeber“).</w:t>
+      </w:r>
+    </w:p>
+    <w:p>
+      <w:pPr>
+        <w:spacing w:after="70"/>
+        <w:jc w:val="both"/>
+      </w:pPr>
+      <w:r>
+        <w:rPr>
+          <w:rFonts w:ascii="Arial" w:cs="Arial" w:eastAsia="Arial" w:hAnsi="Arial"/>
+          <w:color w:val="374151"/>
+          <w:sz w:val="16"/>
+          <w:szCs w:val="16"/>
+        </w:rPr>
+        <w:t xml:space="preserve">Es beschreibt den angebotenen Leistungsumfang samt Preisen und bildet gemeinsam mit den nachstehenden Bestimmungen die Grundlage einer allfälligen Beauftragung. Mit der Auftragserteilung (Punkt 8) gelten die in diesem Dokument enthaltenen Bedingungen als vereinbart.</w:t>
+      </w:r>
+    </w:p>
+    <w:p>
+      <w:pPr>
+        <w:pBdr>
+          <w:bottom w:val="single" w:color="C9A84C" w:sz="8" w:space="6"/>
+        </w:pBdr>
+        <w:spacing w:after="100" w:before="340"/>
+      </w:pPr>
+      <w:r>
+        <w:rPr>
+          <w:rFonts w:ascii="Arial" w:cs="Arial" w:eastAsia="Arial" w:hAnsi="Arial"/>
+          <w:b/>
+          <w:bCs/>
+          <w:color w:val="111827"/>
+          <w:spacing w:val="8"/>
+          <w:sz w:val="21"/>
+          <w:szCs w:val="21"/>
+        </w:rPr>
+        <w:t xml:space="preserve">1)  ANGEBOTSDATEN &amp; PREISE</w:t>
+      </w:r>
+    </w:p>
+    <w:p>
+      <w:pPr>
+        <w:spacing w:after="70"/>
+        <w:jc w:val="both"/>
+      </w:pPr>
+      <w:r>
+        <w:rPr>
+          <w:rFonts w:ascii="Arial" w:cs="Arial" w:eastAsia="Arial" w:hAnsi="Arial"/>
+          <w:color w:val="374151"/>
+          <w:sz w:val="16"/>
+          <w:szCs w:val="16"/>
+        </w:rPr>
+        <w:t xml:space="preserve">Alle Preise verstehen sich in {currency}, netto zuzüglich der gesetzlichen Umsatzsteuer. Dieses Angebot ist freibleibend und gültig bis {valid_until}.</w:t>
       </w:r>
     </w:p>
     <w:tbl>
@@ -1378,14 +1452,723 @@
         </w:tc>
       </w:tr>
     </w:tbl>
+    <w:p>
+      <w:pPr>
+        <w:pBdr>
+          <w:bottom w:val="single" w:color="C9A84C" w:sz="8" w:space="6"/>
+        </w:pBdr>
+        <w:spacing w:after="100" w:before="340"/>
+      </w:pPr>
+      <w:r>
+        <w:rPr>
+          <w:rFonts w:ascii="Arial" w:cs="Arial" w:eastAsia="Arial" w:hAnsi="Arial"/>
+          <w:b/>
+          <w:bCs/>
+          <w:color w:val="111827"/>
+          <w:spacing w:val="8"/>
+          <w:sz w:val="21"/>
+          <w:szCs w:val="21"/>
+        </w:rPr>
+        <w:t xml:space="preserve">2)  LEISTUNGSBESCHREIBUNG</w:t>
+      </w:r>
+    </w:p>
+    <w:p>
+      <w:pPr>
+        <w:spacing w:after="70"/>
+        <w:jc w:val="both"/>
+      </w:pPr>
+      <w:r>
+        <w:rPr>
+          <w:rFonts w:ascii="Arial" w:cs="Arial" w:eastAsia="Arial" w:hAnsi="Arial"/>
+          <w:color w:val="374151"/>
+          <w:sz w:val="16"/>
+          <w:szCs w:val="16"/>
+        </w:rPr>
+        <w:t xml:space="preserve">Der Auftragnehmer erbringt für den Auftraggeber die nachstehend beschriebenen Leistungen. Ergänzende oder abweichende Leistungen bedürfen einer gesonderten schriftlichen Vereinbarung.</w:t>
+      </w:r>
+    </w:p>
+    <w:p>
+      <w:pPr>
+        <w:spacing w:after="70"/>
+        <w:jc w:val="both"/>
+      </w:pPr>
+      <w:r>
+        <w:rPr>
+          <w:rFonts w:ascii="Arial" w:cs="Arial" w:eastAsia="Arial" w:hAnsi="Arial"/>
+          <w:color w:val="374151"/>
+          <w:sz w:val="16"/>
+          <w:szCs w:val="16"/>
+        </w:rPr>
+        <w:t xml:space="preserve">{service_description}</w:t>
+      </w:r>
+    </w:p>
+    <w:p>
+      <w:pPr>
+        <w:spacing w:after="30"/>
+        <w:ind w:left="220"/>
+      </w:pPr>
+      <w:r>
+        <w:rPr>
+          <w:rFonts w:ascii="Arial" w:cs="Arial" w:eastAsia="Arial" w:hAnsi="Arial"/>
+          <w:color w:val="C9A84C"/>
+          <w:sz w:val="16"/>
+          <w:szCs w:val="16"/>
+        </w:rPr>
+        <w:t xml:space="preserve">▸  </w:t>
+      </w:r>
+      <w:r>
+        <w:rPr>
+          <w:rFonts w:ascii="Arial" w:cs="Arial" w:eastAsia="Arial" w:hAnsi="Arial"/>
+          <w:color w:val="374151"/>
+          <w:sz w:val="16"/>
+          <w:szCs w:val="16"/>
+        </w:rPr>
+        <w:t xml:space="preserve">Lieferung, Installation und Inbetriebnahme der angebotenen Infrastruktur</w:t>
+      </w:r>
+    </w:p>
+    <w:p>
+      <w:pPr>
+        <w:spacing w:after="30"/>
+        <w:ind w:left="220"/>
+      </w:pPr>
+      <w:r>
+        <w:rPr>
+          <w:rFonts w:ascii="Arial" w:cs="Arial" w:eastAsia="Arial" w:hAnsi="Arial"/>
+          <w:color w:val="C9A84C"/>
+          <w:sz w:val="16"/>
+          <w:szCs w:val="16"/>
+        </w:rPr>
+        <w:t xml:space="preserve">▸  </w:t>
+      </w:r>
+      <w:r>
+        <w:rPr>
+          <w:rFonts w:ascii="Arial" w:cs="Arial" w:eastAsia="Arial" w:hAnsi="Arial"/>
+          <w:color w:val="374151"/>
+          <w:sz w:val="16"/>
+          <w:szCs w:val="16"/>
+        </w:rPr>
+        <w:t xml:space="preserve">Konfiguration, Integration sowie Migration bestehender Systeme und Daten</w:t>
+      </w:r>
+    </w:p>
+    <w:p>
+      <w:pPr>
+        <w:spacing w:after="30"/>
+        <w:ind w:left="220"/>
+      </w:pPr>
+      <w:r>
+        <w:rPr>
+          <w:rFonts w:ascii="Arial" w:cs="Arial" w:eastAsia="Arial" w:hAnsi="Arial"/>
+          <w:color w:val="C9A84C"/>
+          <w:sz w:val="16"/>
+          <w:szCs w:val="16"/>
+        </w:rPr>
+        <w:t xml:space="preserve">▸  </w:t>
+      </w:r>
+      <w:r>
+        <w:rPr>
+          <w:rFonts w:ascii="Arial" w:cs="Arial" w:eastAsia="Arial" w:hAnsi="Arial"/>
+          <w:color w:val="374151"/>
+          <w:sz w:val="16"/>
+          <w:szCs w:val="16"/>
+        </w:rPr>
+        <w:t xml:space="preserve">Einschulung der Administratoren und Übergabe der technischen Dokumentation</w:t>
+      </w:r>
+    </w:p>
+    <w:p>
+      <w:pPr>
+        <w:spacing w:after="30"/>
+        <w:ind w:left="220"/>
+      </w:pPr>
+      <w:r>
+        <w:rPr>
+          <w:rFonts w:ascii="Arial" w:cs="Arial" w:eastAsia="Arial" w:hAnsi="Arial"/>
+          <w:color w:val="C9A84C"/>
+          <w:sz w:val="16"/>
+          <w:szCs w:val="16"/>
+        </w:rPr>
+        <w:t xml:space="preserve">▸  </w:t>
+      </w:r>
+      <w:r>
+        <w:rPr>
+          <w:rFonts w:ascii="Arial" w:cs="Arial" w:eastAsia="Arial" w:hAnsi="Arial"/>
+          <w:color w:val="374151"/>
+          <w:sz w:val="16"/>
+          <w:szCs w:val="16"/>
+        </w:rPr>
+        <w:t xml:space="preserve">Optionale Managed Services, Wartung und Support gemäß vereinbartem Service-Level-Agreement (SLA)</w:t>
+      </w:r>
+    </w:p>
+    <w:p>
+      <w:pPr>
+        <w:pBdr>
+          <w:bottom w:val="single" w:color="C9A84C" w:sz="8" w:space="6"/>
+        </w:pBdr>
+        <w:spacing w:after="100" w:before="340"/>
+      </w:pPr>
+      <w:r>
+        <w:rPr>
+          <w:rFonts w:ascii="Arial" w:cs="Arial" w:eastAsia="Arial" w:hAnsi="Arial"/>
+          <w:b/>
+          <w:bCs/>
+          <w:color w:val="111827"/>
+          <w:spacing w:val="8"/>
+          <w:sz w:val="21"/>
+          <w:szCs w:val="21"/>
+        </w:rPr>
+        <w:t xml:space="preserve">3)  ALLGEMEINE BESTIMMUNGEN</w:t>
+      </w:r>
+    </w:p>
+    <w:p>
+      <w:pPr>
+        <w:spacing w:after="40" w:before="180"/>
+      </w:pPr>
+      <w:r>
+        <w:rPr>
+          <w:rFonts w:ascii="Arial" w:cs="Arial" w:eastAsia="Arial" w:hAnsi="Arial"/>
+          <w:b/>
+          <w:bCs/>
+          <w:color w:val="111827"/>
+          <w:sz w:val="17"/>
+          <w:szCs w:val="17"/>
+        </w:rPr>
+        <w:t xml:space="preserve">3.1  Rücktrittsrecht</w:t>
+      </w:r>
+    </w:p>
+    <w:p>
+      <w:pPr>
+        <w:spacing w:after="70"/>
+        <w:jc w:val="both"/>
+      </w:pPr>
+      <w:r>
+        <w:rPr>
+          <w:rFonts w:ascii="Arial" w:cs="Arial" w:eastAsia="Arial" w:hAnsi="Arial"/>
+          <w:color w:val="374151"/>
+          <w:sz w:val="16"/>
+          <w:szCs w:val="16"/>
+        </w:rPr>
+        <w:t xml:space="preserve">Ist der Auftraggeber Unternehmer im Sinne des UGB, besteht kein gesetzliches Rücktritts- bzw. Widerrufsrecht. Ein einvernehmlicher Rücktritt ist bis zum Beginn der Leistungserbringung gegen Ersatz der bis dahin angefallenen Aufwände und getätigten Bestellungen möglich.</w:t>
+      </w:r>
+    </w:p>
+    <w:p>
+      <w:pPr>
+        <w:spacing w:after="40" w:before="180"/>
+      </w:pPr>
+      <w:r>
+        <w:rPr>
+          <w:rFonts w:ascii="Arial" w:cs="Arial" w:eastAsia="Arial" w:hAnsi="Arial"/>
+          <w:b/>
+          <w:bCs/>
+          <w:color w:val="111827"/>
+          <w:sz w:val="17"/>
+          <w:szCs w:val="17"/>
+        </w:rPr>
+        <w:t xml:space="preserve">3.2  Gewährleistung, Wartung, Änderungen</w:t>
+      </w:r>
+    </w:p>
+    <w:p>
+      <w:pPr>
+        <w:spacing w:after="70"/>
+        <w:jc w:val="both"/>
+      </w:pPr>
+      <w:r>
+        <w:rPr>
+          <w:rFonts w:ascii="Arial" w:cs="Arial" w:eastAsia="Arial" w:hAnsi="Arial"/>
+          <w:color w:val="374151"/>
+          <w:sz w:val="16"/>
+          <w:szCs w:val="16"/>
+        </w:rPr>
+        <w:t xml:space="preserve">Es gelten die gesetzlichen Gewährleistungsbestimmungen. Wartungs- und Supportleistungen richten sich nach dem jeweils vereinbarten SLA. Änderungen des Leistungsumfangs (Change Requests) bedürfen der Schriftform und werden nach Aufwand oder gesonderter Vereinbarung verrechnet.</w:t>
+      </w:r>
+    </w:p>
+    <w:p>
+      <w:pPr>
+        <w:spacing w:after="40" w:before="180"/>
+      </w:pPr>
+      <w:r>
+        <w:rPr>
+          <w:rFonts w:ascii="Arial" w:cs="Arial" w:eastAsia="Arial" w:hAnsi="Arial"/>
+          <w:b/>
+          <w:bCs/>
+          <w:color w:val="111827"/>
+          <w:sz w:val="17"/>
+          <w:szCs w:val="17"/>
+        </w:rPr>
+        <w:t xml:space="preserve">3.3  Haftung</w:t>
+      </w:r>
+    </w:p>
+    <w:p>
+      <w:pPr>
+        <w:spacing w:after="70"/>
+        <w:jc w:val="both"/>
+      </w:pPr>
+      <w:r>
+        <w:rPr>
+          <w:rFonts w:ascii="Arial" w:cs="Arial" w:eastAsia="Arial" w:hAnsi="Arial"/>
+          <w:color w:val="374151"/>
+          <w:sz w:val="16"/>
+          <w:szCs w:val="16"/>
+        </w:rPr>
+        <w:t xml:space="preserve">Der Auftragnehmer haftet nur für Vorsatz und grobe Fahrlässigkeit; die Haftung für leichte Fahrlässigkeit ist – soweit gesetzlich zulässig – ausgeschlossen. Die Haftung ist der Höhe nach mit dem Netto-Auftragswert begrenzt. Für Datenverlust haftet der Auftragnehmer nur, sofern der Auftraggeber eine dem Stand der Technik entsprechende Datensicherung sichergestellt hat.</w:t>
+      </w:r>
+    </w:p>
+    <w:p>
+      <w:pPr>
+        <w:spacing w:after="40" w:before="180"/>
+      </w:pPr>
+      <w:r>
+        <w:rPr>
+          <w:rFonts w:ascii="Arial" w:cs="Arial" w:eastAsia="Arial" w:hAnsi="Arial"/>
+          <w:b/>
+          <w:bCs/>
+          <w:color w:val="111827"/>
+          <w:sz w:val="17"/>
+          <w:szCs w:val="17"/>
+        </w:rPr>
+        <w:t xml:space="preserve">3.4  Urheberrecht und Nutzung</w:t>
+      </w:r>
+    </w:p>
+    <w:p>
+      <w:pPr>
+        <w:spacing w:after="70"/>
+        <w:jc w:val="both"/>
+      </w:pPr>
+      <w:r>
+        <w:rPr>
+          <w:rFonts w:ascii="Arial" w:cs="Arial" w:eastAsia="Arial" w:hAnsi="Arial"/>
+          <w:color w:val="374151"/>
+          <w:sz w:val="16"/>
+          <w:szCs w:val="16"/>
+        </w:rPr>
+        <w:t xml:space="preserve">Konzepte, Dokumentationen sowie individuell erstellte Software und Konfigurationen bleiben bis zur vollständigen Bezahlung im Eigentum des Auftragnehmers. Der Auftraggeber erhält daran ein nicht ausschließliches, nicht übertragbares Nutzungsrecht für den vereinbarten Einsatzzweck.</w:t>
+      </w:r>
+    </w:p>
+    <w:p>
+      <w:pPr>
+        <w:spacing w:after="40" w:before="180"/>
+      </w:pPr>
+      <w:r>
+        <w:rPr>
+          <w:rFonts w:ascii="Arial" w:cs="Arial" w:eastAsia="Arial" w:hAnsi="Arial"/>
+          <w:b/>
+          <w:bCs/>
+          <w:color w:val="111827"/>
+          <w:sz w:val="17"/>
+          <w:szCs w:val="17"/>
+        </w:rPr>
+        <w:t xml:space="preserve">3.5  Loyalität</w:t>
+      </w:r>
+    </w:p>
+    <w:p>
+      <w:pPr>
+        <w:spacing w:after="70"/>
+        <w:jc w:val="both"/>
+      </w:pPr>
+      <w:r>
+        <w:rPr>
+          <w:rFonts w:ascii="Arial" w:cs="Arial" w:eastAsia="Arial" w:hAnsi="Arial"/>
+          <w:color w:val="374151"/>
+          <w:sz w:val="16"/>
+          <w:szCs w:val="16"/>
+        </w:rPr>
+        <w:t xml:space="preserve">Die Vertragspartner verpflichten sich, während der Dauer der Zusammenarbeit sowie für zwölf Monate danach keine Mitarbeiter des jeweils anderen Vertragspartners aktiv abzuwerben.</w:t>
+      </w:r>
+    </w:p>
+    <w:p>
+      <w:pPr>
+        <w:spacing w:after="40" w:before="180"/>
+      </w:pPr>
+      <w:r>
+        <w:rPr>
+          <w:rFonts w:ascii="Arial" w:cs="Arial" w:eastAsia="Arial" w:hAnsi="Arial"/>
+          <w:b/>
+          <w:bCs/>
+          <w:color w:val="111827"/>
+          <w:sz w:val="17"/>
+          <w:szCs w:val="17"/>
+        </w:rPr>
+        <w:t xml:space="preserve">3.6  Datenschutz und Geheimhaltung</w:t>
+      </w:r>
+    </w:p>
+    <w:p>
+      <w:pPr>
+        <w:spacing w:after="70"/>
+        <w:jc w:val="both"/>
+      </w:pPr>
+      <w:r>
+        <w:rPr>
+          <w:rFonts w:ascii="Arial" w:cs="Arial" w:eastAsia="Arial" w:hAnsi="Arial"/>
+          <w:color w:val="374151"/>
+          <w:sz w:val="16"/>
+          <w:szCs w:val="16"/>
+        </w:rPr>
+        <w:t xml:space="preserve">Die Vertragspartner behandeln alle im Rahmen der Zusammenarbeit erlangten, nicht offenkundigen Informationen vertraulich. Die Verarbeitung personenbezogener Daten erfolgt nach der DSGVO; Näheres regelt die Auftragsverarbeitungsvereinbarung in Punkt 4.</w:t>
+      </w:r>
+    </w:p>
+    <w:p>
+      <w:pPr>
+        <w:pBdr>
+          <w:bottom w:val="single" w:color="C9A84C" w:sz="8" w:space="6"/>
+        </w:pBdr>
+        <w:spacing w:after="100" w:before="340"/>
+      </w:pPr>
+      <w:r>
+        <w:rPr>
+          <w:rFonts w:ascii="Arial" w:cs="Arial" w:eastAsia="Arial" w:hAnsi="Arial"/>
+          <w:b/>
+          <w:bCs/>
+          <w:color w:val="111827"/>
+          <w:spacing w:val="8"/>
+          <w:sz w:val="21"/>
+          <w:szCs w:val="21"/>
+        </w:rPr>
+        <w:t xml:space="preserve">4)  AUFTRAGSVERARBEITUNGSVEREINBARUNG</w:t>
+      </w:r>
+    </w:p>
+    <w:p>
+      <w:pPr>
+        <w:spacing w:after="70"/>
+        <w:jc w:val="both"/>
+      </w:pPr>
+      <w:r>
+        <w:rPr>
+          <w:rFonts w:ascii="Arial" w:cs="Arial" w:eastAsia="Arial" w:hAnsi="Arial"/>
+          <w:color w:val="374151"/>
+          <w:sz w:val="16"/>
+          <w:szCs w:val="16"/>
+        </w:rPr>
+        <w:t xml:space="preserve">Soweit der Auftragnehmer im Rahmen der Leistungserbringung personenbezogene Daten im Auftrag des Auftraggebers verarbeitet, gilt ergänzend die nachstehende Vereinbarung gemäß Art 28 DSGVO.</w:t>
+      </w:r>
+    </w:p>
+    <w:p>
+      <w:pPr>
+        <w:spacing w:after="40" w:before="180"/>
+      </w:pPr>
+      <w:r>
+        <w:rPr>
+          <w:rFonts w:ascii="Arial" w:cs="Arial" w:eastAsia="Arial" w:hAnsi="Arial"/>
+          <w:b/>
+          <w:bCs/>
+          <w:color w:val="111827"/>
+          <w:sz w:val="17"/>
+          <w:szCs w:val="17"/>
+        </w:rPr>
+        <w:t xml:space="preserve">4.1  Weisungsrecht</w:t>
+      </w:r>
+    </w:p>
+    <w:p>
+      <w:pPr>
+        <w:spacing w:after="70"/>
+        <w:jc w:val="both"/>
+      </w:pPr>
+      <w:r>
+        <w:rPr>
+          <w:rFonts w:ascii="Arial" w:cs="Arial" w:eastAsia="Arial" w:hAnsi="Arial"/>
+          <w:color w:val="374151"/>
+          <w:sz w:val="16"/>
+          <w:szCs w:val="16"/>
+        </w:rPr>
+        <w:t xml:space="preserve">Der Auftragnehmer verarbeitet personenbezogene Daten ausschließlich auf dokumentierte Weisung des Auftraggebers, es sei denn, er ist gesetzlich zur Verarbeitung verpflichtet.</w:t>
+      </w:r>
+    </w:p>
+    <w:p>
+      <w:pPr>
+        <w:spacing w:after="40" w:before="180"/>
+      </w:pPr>
+      <w:r>
+        <w:rPr>
+          <w:rFonts w:ascii="Arial" w:cs="Arial" w:eastAsia="Arial" w:hAnsi="Arial"/>
+          <w:b/>
+          <w:bCs/>
+          <w:color w:val="111827"/>
+          <w:sz w:val="17"/>
+          <w:szCs w:val="17"/>
+        </w:rPr>
+        <w:t xml:space="preserve">4.2  Vertraulichkeit</w:t>
+      </w:r>
+    </w:p>
+    <w:p>
+      <w:pPr>
+        <w:spacing w:after="70"/>
+        <w:jc w:val="both"/>
+      </w:pPr>
+      <w:r>
+        <w:rPr>
+          <w:rFonts w:ascii="Arial" w:cs="Arial" w:eastAsia="Arial" w:hAnsi="Arial"/>
+          <w:color w:val="374151"/>
+          <w:sz w:val="16"/>
+          <w:szCs w:val="16"/>
+        </w:rPr>
+        <w:t xml:space="preserve">Der Auftragnehmer stellt sicher, dass die zur Verarbeitung befugten Personen zur Vertraulichkeit verpflichtet sind oder einer angemessenen gesetzlichen Verschwiegenheitspflicht unterliegen.</w:t>
+      </w:r>
+    </w:p>
+    <w:p>
+      <w:pPr>
+        <w:spacing w:after="40" w:before="180"/>
+      </w:pPr>
+      <w:r>
+        <w:rPr>
+          <w:rFonts w:ascii="Arial" w:cs="Arial" w:eastAsia="Arial" w:hAnsi="Arial"/>
+          <w:b/>
+          <w:bCs/>
+          <w:color w:val="111827"/>
+          <w:sz w:val="17"/>
+          <w:szCs w:val="17"/>
+        </w:rPr>
+        <w:t xml:space="preserve">4.3  Datensicherheit</w:t>
+      </w:r>
+    </w:p>
+    <w:p>
+      <w:pPr>
+        <w:spacing w:after="70"/>
+        <w:jc w:val="both"/>
+      </w:pPr>
+      <w:r>
+        <w:rPr>
+          <w:rFonts w:ascii="Arial" w:cs="Arial" w:eastAsia="Arial" w:hAnsi="Arial"/>
+          <w:color w:val="374151"/>
+          <w:sz w:val="16"/>
+          <w:szCs w:val="16"/>
+        </w:rPr>
+        <w:t xml:space="preserve">Der Auftragnehmer trifft geeignete technische und organisatorische Maßnahmen gemäß Art 32 DSGVO – insbesondere Verschlüsselung, Zutritts- und Zugriffskontrolle, Datensicherung sowie Protokollierung – und passt diese dem Stand der Technik an.</w:t>
+      </w:r>
+    </w:p>
+    <w:p>
+      <w:pPr>
+        <w:spacing w:after="40" w:before="180"/>
+      </w:pPr>
+      <w:r>
+        <w:rPr>
+          <w:rFonts w:ascii="Arial" w:cs="Arial" w:eastAsia="Arial" w:hAnsi="Arial"/>
+          <w:b/>
+          <w:bCs/>
+          <w:color w:val="111827"/>
+          <w:sz w:val="17"/>
+          <w:szCs w:val="17"/>
+        </w:rPr>
+        <w:t xml:space="preserve">4.4  Sub-Auftragsverarbeitung</w:t>
+      </w:r>
+    </w:p>
+    <w:p>
+      <w:pPr>
+        <w:spacing w:after="70"/>
+        <w:jc w:val="both"/>
+      </w:pPr>
+      <w:r>
+        <w:rPr>
+          <w:rFonts w:ascii="Arial" w:cs="Arial" w:eastAsia="Arial" w:hAnsi="Arial"/>
+          <w:color w:val="374151"/>
+          <w:sz w:val="16"/>
+          <w:szCs w:val="16"/>
+        </w:rPr>
+        <w:t xml:space="preserve">Die Beiziehung weiterer Auftragsverarbeiter erfolgt nur mit vorheriger, allgemeiner oder gesonderter Zustimmung des Auftraggebers. Der Auftragnehmer erlegt dem Sub-Auftragsverarbeiter dieselben Datenschutzpflichten auf.</w:t>
+      </w:r>
+    </w:p>
+    <w:p>
+      <w:pPr>
+        <w:spacing w:after="40" w:before="180"/>
+      </w:pPr>
+      <w:r>
+        <w:rPr>
+          <w:rFonts w:ascii="Arial" w:cs="Arial" w:eastAsia="Arial" w:hAnsi="Arial"/>
+          <w:b/>
+          <w:bCs/>
+          <w:color w:val="111827"/>
+          <w:sz w:val="17"/>
+          <w:szCs w:val="17"/>
+        </w:rPr>
+        <w:t xml:space="preserve">4.5  Unterstützung</w:t>
+      </w:r>
+    </w:p>
+    <w:p>
+      <w:pPr>
+        <w:spacing w:after="70"/>
+        <w:jc w:val="both"/>
+      </w:pPr>
+      <w:r>
+        <w:rPr>
+          <w:rFonts w:ascii="Arial" w:cs="Arial" w:eastAsia="Arial" w:hAnsi="Arial"/>
+          <w:color w:val="374151"/>
+          <w:sz w:val="16"/>
+          <w:szCs w:val="16"/>
+        </w:rPr>
+        <w:t xml:space="preserve">Der Auftragnehmer unterstützt den Auftraggeber im Rahmen des Zumutbaren bei der Beantwortung von Betroffenenanfragen sowie bei der Einhaltung der Pflichten gemäß Art 32 bis 36 DSGVO (u. a. Meldung von Datenschutzverletzungen).</w:t>
+      </w:r>
+    </w:p>
+    <w:p>
+      <w:pPr>
+        <w:spacing w:after="40" w:before="180"/>
+      </w:pPr>
+      <w:r>
+        <w:rPr>
+          <w:rFonts w:ascii="Arial" w:cs="Arial" w:eastAsia="Arial" w:hAnsi="Arial"/>
+          <w:b/>
+          <w:bCs/>
+          <w:color w:val="111827"/>
+          <w:sz w:val="17"/>
+          <w:szCs w:val="17"/>
+        </w:rPr>
+        <w:t xml:space="preserve">4.6  Rückgabe von personenbezogenen Daten</w:t>
+      </w:r>
+    </w:p>
+    <w:p>
+      <w:pPr>
+        <w:spacing w:after="70"/>
+        <w:jc w:val="both"/>
+      </w:pPr>
+      <w:r>
+        <w:rPr>
+          <w:rFonts w:ascii="Arial" w:cs="Arial" w:eastAsia="Arial" w:hAnsi="Arial"/>
+          <w:color w:val="374151"/>
+          <w:sz w:val="16"/>
+          <w:szCs w:val="16"/>
+        </w:rPr>
+        <w:t xml:space="preserve">Nach Beendigung der Leistung werden sämtliche personenbezogenen Daten nach Wahl des Auftraggebers zurückgegeben oder gelöscht, sofern keine gesetzliche Aufbewahrungspflicht entgegensteht.</w:t>
+      </w:r>
+    </w:p>
+    <w:p>
+      <w:pPr>
+        <w:spacing w:after="40" w:before="180"/>
+      </w:pPr>
+      <w:r>
+        <w:rPr>
+          <w:rFonts w:ascii="Arial" w:cs="Arial" w:eastAsia="Arial" w:hAnsi="Arial"/>
+          <w:b/>
+          <w:bCs/>
+          <w:color w:val="111827"/>
+          <w:sz w:val="17"/>
+          <w:szCs w:val="17"/>
+        </w:rPr>
+        <w:t xml:space="preserve">4.7  Überprüfung</w:t>
+      </w:r>
+    </w:p>
+    <w:p>
+      <w:pPr>
+        <w:spacing w:after="70"/>
+        <w:jc w:val="both"/>
+      </w:pPr>
+      <w:r>
+        <w:rPr>
+          <w:rFonts w:ascii="Arial" w:cs="Arial" w:eastAsia="Arial" w:hAnsi="Arial"/>
+          <w:color w:val="374151"/>
+          <w:sz w:val="16"/>
+          <w:szCs w:val="16"/>
+        </w:rPr>
+        <w:t xml:space="preserve">Der Auftragnehmer stellt dem Auftraggeber alle zum Nachweis der Einhaltung erforderlichen Informationen zur Verfügung und ermöglicht angemessene Überprüfungen bzw. Audits nach vorheriger Ankündigung.</w:t>
+      </w:r>
+    </w:p>
+    <w:p>
+      <w:pPr>
+        <w:pBdr>
+          <w:bottom w:val="single" w:color="C9A84C" w:sz="8" w:space="6"/>
+        </w:pBdr>
+        <w:spacing w:after="100" w:before="340"/>
+      </w:pPr>
+      <w:r>
+        <w:rPr>
+          <w:rFonts w:ascii="Arial" w:cs="Arial" w:eastAsia="Arial" w:hAnsi="Arial"/>
+          <w:b/>
+          <w:bCs/>
+          <w:color w:val="111827"/>
+          <w:spacing w:val="8"/>
+          <w:sz w:val="21"/>
+          <w:szCs w:val="21"/>
+        </w:rPr>
+        <w:t xml:space="preserve">6)  GERICHTSSTAND</w:t>
+      </w:r>
+    </w:p>
+    <w:p>
+      <w:pPr>
+        <w:spacing w:after="70"/>
+        <w:jc w:val="both"/>
+      </w:pPr>
+      <w:r>
+        <w:rPr>
+          <w:rFonts w:ascii="Arial" w:cs="Arial" w:eastAsia="Arial" w:hAnsi="Arial"/>
+          <w:color w:val="374151"/>
+          <w:sz w:val="16"/>
+          <w:szCs w:val="16"/>
+        </w:rPr>
+        <w:t xml:space="preserve">Es gilt österreichisches Recht unter Ausschluss der Verweisungsnormen des internationalen Privatrechts sowie des UN-Kaufrechts. Ausschließlicher Gerichtsstand für alle Streitigkeiten aus oder im Zusammenhang mit diesem Vertrag ist das sachlich zuständige Gericht in Wien.</w:t>
+      </w:r>
+    </w:p>
+    <w:p>
+      <w:pPr>
+        <w:pBdr>
+          <w:bottom w:val="single" w:color="C9A84C" w:sz="8" w:space="6"/>
+        </w:pBdr>
+        <w:spacing w:after="100" w:before="340"/>
+      </w:pPr>
+      <w:r>
+        <w:rPr>
+          <w:rFonts w:ascii="Arial" w:cs="Arial" w:eastAsia="Arial" w:hAnsi="Arial"/>
+          <w:b/>
+          <w:bCs/>
+          <w:color w:val="111827"/>
+          <w:spacing w:val="8"/>
+          <w:sz w:val="21"/>
+          <w:szCs w:val="21"/>
+        </w:rPr>
+        <w:t xml:space="preserve">7)  SCHLUSSBESTIMMUNGEN</w:t>
+      </w:r>
+    </w:p>
+    <w:p>
+      <w:pPr>
+        <w:spacing w:after="70"/>
+        <w:jc w:val="both"/>
+      </w:pPr>
+      <w:r>
+        <w:rPr>
+          <w:rFonts w:ascii="Arial" w:cs="Arial" w:eastAsia="Arial" w:hAnsi="Arial"/>
+          <w:color w:val="374151"/>
+          <w:sz w:val="16"/>
+          <w:szCs w:val="16"/>
+        </w:rPr>
+        <w:t xml:space="preserve">Änderungen und Ergänzungen bedürfen der Schriftform; dies gilt auch für ein Abgehen vom Schriftformerfordernis. Sollten einzelne Bestimmungen unwirksam sein oder werden, bleibt die Wirksamkeit der übrigen Bestimmungen unberührt (salvatorische Klausel); an die Stelle der unwirksamen Bestimmung tritt eine dem wirtschaftlichen Zweck möglichst nahekommende Regelung.</w:t>
+      </w:r>
+    </w:p>
+    <w:p>
+      <w:pPr>
+        <w:pBdr>
+          <w:bottom w:val="single" w:color="C9A84C" w:sz="8" w:space="6"/>
+        </w:pBdr>
+        <w:spacing w:after="100" w:before="340"/>
+      </w:pPr>
+      <w:r>
+        <w:rPr>
+          <w:rFonts w:ascii="Arial" w:cs="Arial" w:eastAsia="Arial" w:hAnsi="Arial"/>
+          <w:b/>
+          <w:bCs/>
+          <w:color w:val="111827"/>
+          <w:spacing w:val="8"/>
+          <w:sz w:val="21"/>
+          <w:szCs w:val="21"/>
+        </w:rPr>
+        <w:t xml:space="preserve">8)  AUFTRAGSERTEILUNG</w:t>
+      </w:r>
+    </w:p>
+    <w:p>
+      <w:pPr>
+        <w:spacing w:after="70"/>
+        <w:jc w:val="both"/>
+      </w:pPr>
+      <w:r>
+        <w:rPr>
+          <w:rFonts w:ascii="Arial" w:cs="Arial" w:eastAsia="Arial" w:hAnsi="Arial"/>
+          <w:color w:val="374151"/>
+          <w:sz w:val="16"/>
+          <w:szCs w:val="16"/>
+        </w:rPr>
+        <w:t xml:space="preserve">Der Auftraggeber erteilt hiermit den Auftrag zu den vorstehenden Leistungen, Preisen und Bedingungen.</w:t>
+      </w:r>
+    </w:p>
     <w:tbl>
       <w:tblPr>
         <w:tblW w:type="dxa" w:w="9638"/>
         <w:tblBorders>
-          <w:top w:val="none" w:color="FFFFFF" w:sz="0"/>
-          <w:left w:val="none" w:color="FFFFFF" w:sz="0"/>
-          <w:bottom w:val="none" w:color="FFFFFF" w:sz="0"/>
-          <w:right w:val="none" w:color="FFFFFF" w:sz="0"/>
+          <w:top w:val="single" w:color="C9A84C" w:sz="6"/>
+          <w:left w:val="single" w:color="C9A84C" w:sz="6"/>
+          <w:bottom w:val="single" w:color="C9A84C" w:sz="6"/>
+          <w:right w:val="single" w:color="C9A84C" w:sz="6"/>
           <w:insideH w:val="single" w:color="auto" w:sz="4"/>
           <w:insideV w:val="single" w:color="auto" w:sz="4"/>
         </w:tblBorders>
@@ -1404,60 +2187,225 @@
               <w:right w:val="none" w:color="FFFFFF" w:sz="0"/>
             </w:tcBorders>
             <w:tcMar>
-              <w:top w:type="dxa" w:w="360"/>
-              <w:left w:type="dxa" w:w="0"/>
-              <w:bottom w:type="dxa" w:w="0"/>
-              <w:right w:type="dxa" w:w="0"/>
+              <w:top w:type="dxa" w:w="140"/>
+              <w:left w:type="dxa" w:w="160"/>
+              <w:bottom w:type="dxa" w:w="140"/>
+              <w:right w:type="dxa" w:w="160"/>
             </w:tcMar>
           </w:tcPr>
           <w:p>
-            <w:pPr>
-              <w:spacing w:after="80"/>
-            </w:pPr>
             <w:r>
               <w:rPr>
                 <w:rFonts w:ascii="Arial" w:cs="Arial" w:eastAsia="Arial" w:hAnsi="Arial"/>
                 <w:b/>
                 <w:bCs/>
-                <w:color w:val="6B7280"/>
-                <w:spacing w:val="20"/>
-                <w:sz w:val="15"/>
-                <w:szCs w:val="15"/>
-              </w:rPr>
-              <w:t xml:space="preserve">ANGEBOTSKONDITIONEN</w:t>
-            </w:r>
-          </w:p>
-          <w:p>
-            <w:r>
-              <w:rPr>
-                <w:rFonts w:ascii="Arial" w:cs="Arial" w:eastAsia="Arial" w:hAnsi="Arial"/>
                 <w:color w:val="111827"/>
                 <w:sz w:val="16"/>
                 <w:szCs w:val="16"/>
               </w:rPr>
-              <w:t xml:space="preserve">Dieses Angebot ist freibleibend und gültig bis {valid_until}. Alle Preise verstehen sich zzgl. gesetzlicher USt.</w:t>
-            </w:r>
-          </w:p>
-          <w:p>
-            <w:pPr>
-              <w:spacing w:before="40"/>
-            </w:pPr>
-            <w:r>
-              <w:rPr>
-                <w:rFonts w:ascii="Arial" w:cs="Arial" w:eastAsia="Arial" w:hAnsi="Arial"/>
-                <w:color w:val="6B7280"/>
+              <w:t xml:space="preserve">Elektronische Beauftragung — </w:t>
+            </w:r>
+            <w:r>
+              <w:rPr>
+                <w:rFonts w:ascii="Arial" w:cs="Arial" w:eastAsia="Arial" w:hAnsi="Arial"/>
+                <w:color w:val="374151"/>
                 <w:sz w:val="16"/>
                 <w:szCs w:val="16"/>
               </w:rPr>
-              <w:t xml:space="preserve">{notes}</w:t>
+              <w:t xml:space="preserve">Sie können dieses Angebot auch elektronisch beauftragen: Senden Sie das unterschriebene Dokument einfach an </w:t>
+            </w:r>
+            <w:r>
+              <w:rPr>
+                <w:rFonts w:ascii="Arial" w:cs="Arial" w:eastAsia="Arial" w:hAnsi="Arial"/>
+                <w:b/>
+                <w:bCs/>
+                <w:color w:val="111827"/>
+                <w:sz w:val="16"/>
+                <w:szCs w:val="16"/>
+              </w:rPr>
+              <w:t xml:space="preserve">order@ferrion.at</w:t>
+            </w:r>
+            <w:r>
+              <w:rPr>
+                <w:rFonts w:ascii="Arial" w:cs="Arial" w:eastAsia="Arial" w:hAnsi="Arial"/>
+                <w:color w:val="374151"/>
+                <w:sz w:val="16"/>
+                <w:szCs w:val="16"/>
+              </w:rPr>
+              <w:t xml:space="preserve">.</w:t>
             </w:r>
           </w:p>
         </w:tc>
       </w:tr>
     </w:tbl>
-    <w:p>
-      <w:pPr>
-        <w:spacing w:after="120" w:before="480"/>
+    <w:tbl>
+      <w:tblPr>
+        <w:tblW w:type="dxa" w:w="9638"/>
+        <w:tblBorders>
+          <w:top w:val="none" w:color="FFFFFF" w:sz="0"/>
+          <w:left w:val="none" w:color="FFFFFF" w:sz="0"/>
+          <w:bottom w:val="none" w:color="FFFFFF" w:sz="0"/>
+          <w:right w:val="none" w:color="FFFFFF" w:sz="0"/>
+          <w:insideH w:val="single" w:color="auto" w:sz="4"/>
+          <w:insideV w:val="single" w:color="auto" w:sz="4"/>
+        </w:tblBorders>
+      </w:tblPr>
+      <w:tblGrid>
+        <w:gridCol w:w="4819"/>
+        <w:gridCol w:w="4819"/>
+      </w:tblGrid>
+      <w:tr>
+        <w:tc>
+          <w:tcPr>
+            <w:tcW w:type="dxa" w:w="4819"/>
+            <w:tcBorders>
+              <w:top w:val="none" w:color="FFFFFF" w:sz="0"/>
+              <w:left w:val="none" w:color="FFFFFF" w:sz="0"/>
+              <w:bottom w:val="none" w:color="FFFFFF" w:sz="0"/>
+              <w:right w:val="none" w:color="FFFFFF" w:sz="0"/>
+            </w:tcBorders>
+            <w:tcMar>
+              <w:top w:type="dxa" w:w="200"/>
+              <w:left w:type="dxa" w:w="0"/>
+              <w:bottom w:type="dxa" w:w="0"/>
+              <w:right w:type="dxa" w:w="200"/>
+            </w:tcMar>
+          </w:tcPr>
+          <w:p>
+            <w:pPr>
+              <w:pBdr>
+                <w:bottom w:val="single" w:color="9CA3AF" w:sz="6" w:space="20"/>
+              </w:pBdr>
+              <w:spacing w:before="380"/>
+            </w:pPr>
+            <w:r>
+              <w:rPr>
+                <w:rFonts w:ascii="Arial" w:cs="Arial" w:eastAsia="Arial" w:hAnsi="Arial"/>
+              </w:rPr>
+              <w:t xml:space="preserve"> </w:t>
+            </w:r>
+          </w:p>
+          <w:p>
+            <w:pPr>
+              <w:spacing w:before="20"/>
+            </w:pPr>
+            <w:r>
+              <w:rPr>
+                <w:rFonts w:ascii="Arial" w:cs="Arial" w:eastAsia="Arial" w:hAnsi="Arial"/>
+                <w:color w:val="6B7280"/>
+                <w:sz w:val="13"/>
+                <w:szCs w:val="13"/>
+              </w:rPr>
+              <w:t xml:space="preserve">Ort, Datum</w:t>
+            </w:r>
+          </w:p>
+          <w:p>
+            <w:pPr>
+              <w:pBdr>
+                <w:bottom w:val="single" w:color="9CA3AF" w:sz="6" w:space="20"/>
+              </w:pBdr>
+              <w:spacing w:before="380"/>
+            </w:pPr>
+            <w:r>
+              <w:rPr>
+                <w:rFonts w:ascii="Arial" w:cs="Arial" w:eastAsia="Arial" w:hAnsi="Arial"/>
+              </w:rPr>
+              <w:t xml:space="preserve"> </w:t>
+            </w:r>
+          </w:p>
+          <w:p>
+            <w:pPr>
+              <w:spacing w:before="20"/>
+            </w:pPr>
+            <w:r>
+              <w:rPr>
+                <w:rFonts w:ascii="Arial" w:cs="Arial" w:eastAsia="Arial" w:hAnsi="Arial"/>
+                <w:color w:val="6B7280"/>
+                <w:sz w:val="13"/>
+                <w:szCs w:val="13"/>
+              </w:rPr>
+              <w:t xml:space="preserve">Auftraggeber — {customer_company}</w:t>
+            </w:r>
+          </w:p>
+        </w:tc>
+        <w:tc>
+          <w:tcPr>
+            <w:tcW w:type="dxa" w:w="4819"/>
+            <w:tcBorders>
+              <w:top w:val="none" w:color="FFFFFF" w:sz="0"/>
+              <w:left w:val="none" w:color="FFFFFF" w:sz="0"/>
+              <w:bottom w:val="none" w:color="FFFFFF" w:sz="0"/>
+              <w:right w:val="none" w:color="FFFFFF" w:sz="0"/>
+            </w:tcBorders>
+            <w:tcMar>
+              <w:top w:type="dxa" w:w="200"/>
+              <w:left w:type="dxa" w:w="0"/>
+              <w:bottom w:type="dxa" w:w="0"/>
+              <w:right w:type="dxa" w:w="200"/>
+            </w:tcMar>
+          </w:tcPr>
+          <w:p>
+            <w:pPr>
+              <w:pBdr>
+                <w:bottom w:val="single" w:color="9CA3AF" w:sz="6" w:space="20"/>
+              </w:pBdr>
+              <w:spacing w:before="380"/>
+            </w:pPr>
+            <w:r>
+              <w:rPr>
+                <w:rFonts w:ascii="Arial" w:cs="Arial" w:eastAsia="Arial" w:hAnsi="Arial"/>
+              </w:rPr>
+              <w:t xml:space="preserve"> </w:t>
+            </w:r>
+          </w:p>
+          <w:p>
+            <w:pPr>
+              <w:spacing w:before="20"/>
+            </w:pPr>
+            <w:r>
+              <w:rPr>
+                <w:rFonts w:ascii="Arial" w:cs="Arial" w:eastAsia="Arial" w:hAnsi="Arial"/>
+                <w:color w:val="6B7280"/>
+                <w:sz w:val="13"/>
+                <w:szCs w:val="13"/>
+              </w:rPr>
+              <w:t xml:space="preserve">Ort, Datum</w:t>
+            </w:r>
+          </w:p>
+          <w:p>
+            <w:pPr>
+              <w:pBdr>
+                <w:bottom w:val="single" w:color="9CA3AF" w:sz="6" w:space="20"/>
+              </w:pBdr>
+              <w:spacing w:before="380"/>
+            </w:pPr>
+            <w:r>
+              <w:rPr>
+                <w:rFonts w:ascii="Arial" w:cs="Arial" w:eastAsia="Arial" w:hAnsi="Arial"/>
+              </w:rPr>
+              <w:t xml:space="preserve"> </w:t>
+            </w:r>
+          </w:p>
+          <w:p>
+            <w:pPr>
+              <w:spacing w:before="20"/>
+            </w:pPr>
+            <w:r>
+              <w:rPr>
+                <w:rFonts w:ascii="Arial" w:cs="Arial" w:eastAsia="Arial" w:hAnsi="Arial"/>
+                <w:color w:val="6B7280"/>
+                <w:sz w:val="13"/>
+                <w:szCs w:val="13"/>
+              </w:rPr>
+              <w:t xml:space="preserve">Ferrion IT Systemhaus GmbH (Auftragnehmer)</w:t>
+            </w:r>
+          </w:p>
+        </w:tc>
+      </w:tr>
+    </w:tbl>
+    <w:p>
+      <w:pPr>
+        <w:spacing w:after="100" w:before="360"/>
         <w:jc w:val="center"/>
       </w:pPr>
       <w:r>
@@ -1486,7 +2434,7 @@
           <w:sz w:val="12"/>
           <w:szCs w:val="12"/>
         </w:rPr>
-        <w:t xml:space="preserve">Platzhalter in { } werden beim Erzeugen automatisch aus den Portal-Daten befüllt.</w:t>
+        <w:t xml:space="preserve">Platzhalter in { } werden beim Erzeugen automatisch aus den Portal-Daten befüllt. Die Rechtstexte sind unverbindliche Muster und vor Verwendung rechtlich zu prüfen.</w:t>
       </w:r>
     </w:p>
     <w:sectPr>

</xml_diff>

<commit_message>
﻿Add section 5 (Zahlungsbedingungen & Verguetung) to the offer template
Fills the previously empty section 5 so the quote is numbered 1-8 with no
gap: 5.1 Verguetung, 5.2 Zahlungsbedingungen, 5.3 Lieferung & Termine,
5.4 Eigentumsvorbehalt (example texts). CI guide updated accordingly.

Co-Authored-By: Claude Opus 4.8 <noreply@anthropic.com>
</commit_message>
<xml_diff>
--- a/templates/Ferrion-Angebotsvorlage.docx
+++ b/templates/Ferrion-Angebotsvorlage.docx
@@ -2073,6 +2073,150 @@
           <w:sz w:val="21"/>
           <w:szCs w:val="21"/>
         </w:rPr>
+        <w:t xml:space="preserve">5)  ZAHLUNGSBEDINGUNGEN &amp; VERGÜTUNG</w:t>
+      </w:r>
+    </w:p>
+    <w:p>
+      <w:pPr>
+        <w:spacing w:after="40" w:before="180"/>
+      </w:pPr>
+      <w:r>
+        <w:rPr>
+          <w:rFonts w:ascii="Arial" w:cs="Arial" w:eastAsia="Arial" w:hAnsi="Arial"/>
+          <w:b/>
+          <w:bCs/>
+          <w:color w:val="111827"/>
+          <w:sz w:val="17"/>
+          <w:szCs w:val="17"/>
+        </w:rPr>
+        <w:t xml:space="preserve">5.1  Vergütung</w:t>
+      </w:r>
+    </w:p>
+    <w:p>
+      <w:pPr>
+        <w:spacing w:after="70"/>
+        <w:jc w:val="both"/>
+      </w:pPr>
+      <w:r>
+        <w:rPr>
+          <w:rFonts w:ascii="Arial" w:cs="Arial" w:eastAsia="Arial" w:hAnsi="Arial"/>
+          <w:color w:val="374151"/>
+          <w:sz w:val="16"/>
+          <w:szCs w:val="16"/>
+        </w:rPr>
+        <w:t xml:space="preserve">Die Vergütung richtet sich nach den in Punkt 1 angeführten Positionen. Alle Preise verstehen sich netto in {currency} zuzüglich der gesetzlichen Umsatzsteuer. Reise-, Fahrt- und Nächtigungskosten werden, sofern nicht anders vereinbart, nach tatsächlichem Aufwand verrechnet.</w:t>
+      </w:r>
+    </w:p>
+    <w:p>
+      <w:pPr>
+        <w:spacing w:after="40" w:before="180"/>
+      </w:pPr>
+      <w:r>
+        <w:rPr>
+          <w:rFonts w:ascii="Arial" w:cs="Arial" w:eastAsia="Arial" w:hAnsi="Arial"/>
+          <w:b/>
+          <w:bCs/>
+          <w:color w:val="111827"/>
+          <w:sz w:val="17"/>
+          <w:szCs w:val="17"/>
+        </w:rPr>
+        <w:t xml:space="preserve">5.2  Zahlungsbedingungen</w:t>
+      </w:r>
+    </w:p>
+    <w:p>
+      <w:pPr>
+        <w:spacing w:after="70"/>
+        <w:jc w:val="both"/>
+      </w:pPr>
+      <w:r>
+        <w:rPr>
+          <w:rFonts w:ascii="Arial" w:cs="Arial" w:eastAsia="Arial" w:hAnsi="Arial"/>
+          <w:color w:val="374151"/>
+          <w:sz w:val="16"/>
+          <w:szCs w:val="16"/>
+        </w:rPr>
+        <w:t xml:space="preserve">Rechnungen sind innerhalb von {payment_terms_days} Tagen ab Rechnungserhalt ohne Abzug zur Zahlung fällig. Bei Projekten kann der Auftragnehmer Teil- oder Anzahlungsrechnungen entsprechend dem Leistungsfortschritt legen. Bei Zahlungsverzug werden Verzugszinsen in gesetzlicher Höhe (bei unternehmerischen Geschäften 9,2 Prozentpunkte über dem Basiszinssatz) sowie angemessene Mahn- und Inkassospesen verrechnet.</w:t>
+      </w:r>
+    </w:p>
+    <w:p>
+      <w:pPr>
+        <w:spacing w:after="40" w:before="180"/>
+      </w:pPr>
+      <w:r>
+        <w:rPr>
+          <w:rFonts w:ascii="Arial" w:cs="Arial" w:eastAsia="Arial" w:hAnsi="Arial"/>
+          <w:b/>
+          <w:bCs/>
+          <w:color w:val="111827"/>
+          <w:sz w:val="17"/>
+          <w:szCs w:val="17"/>
+        </w:rPr>
+        <w:t xml:space="preserve">5.3  Lieferung &amp; Termine</w:t>
+      </w:r>
+    </w:p>
+    <w:p>
+      <w:pPr>
+        <w:spacing w:after="70"/>
+        <w:jc w:val="both"/>
+      </w:pPr>
+      <w:r>
+        <w:rPr>
+          <w:rFonts w:ascii="Arial" w:cs="Arial" w:eastAsia="Arial" w:hAnsi="Arial"/>
+          <w:color w:val="374151"/>
+          <w:sz w:val="16"/>
+          <w:szCs w:val="16"/>
+        </w:rPr>
+        <w:t xml:space="preserve">Die Leistungserbringung beginnt nach Auftragserteilung und Klärung aller technischen Voraussetzungen. Angegebene Liefer- und Leistungstermine ({service_period}) sind, sofern nicht ausdrücklich als verbindlich (Fixtermin) bezeichnet, Richtwerte. Verzögerungen aus der Sphäre des Auftraggebers oder durch höhere Gewalt verlängern die Fristen angemessen.</w:t>
+      </w:r>
+    </w:p>
+    <w:p>
+      <w:pPr>
+        <w:spacing w:after="40" w:before="180"/>
+      </w:pPr>
+      <w:r>
+        <w:rPr>
+          <w:rFonts w:ascii="Arial" w:cs="Arial" w:eastAsia="Arial" w:hAnsi="Arial"/>
+          <w:b/>
+          <w:bCs/>
+          <w:color w:val="111827"/>
+          <w:sz w:val="17"/>
+          <w:szCs w:val="17"/>
+        </w:rPr>
+        <w:t xml:space="preserve">5.4  Eigentumsvorbehalt</w:t>
+      </w:r>
+    </w:p>
+    <w:p>
+      <w:pPr>
+        <w:spacing w:after="70"/>
+        <w:jc w:val="both"/>
+      </w:pPr>
+      <w:r>
+        <w:rPr>
+          <w:rFonts w:ascii="Arial" w:cs="Arial" w:eastAsia="Arial" w:hAnsi="Arial"/>
+          <w:color w:val="374151"/>
+          <w:sz w:val="16"/>
+          <w:szCs w:val="16"/>
+        </w:rPr>
+        <w:t xml:space="preserve">Gelieferte Waren bleiben bis zur vollständigen Bezahlung sämtlicher Forderungen aus der Geschäftsbeziehung im Eigentum des Auftragnehmers.</w:t>
+      </w:r>
+    </w:p>
+    <w:p>
+      <w:pPr>
+        <w:pBdr>
+          <w:bottom w:val="single" w:color="C9A84C" w:sz="8" w:space="6"/>
+        </w:pBdr>
+        <w:spacing w:after="100" w:before="340"/>
+      </w:pPr>
+      <w:r>
+        <w:rPr>
+          <w:rFonts w:ascii="Arial" w:cs="Arial" w:eastAsia="Arial" w:hAnsi="Arial"/>
+          <w:b/>
+          <w:bCs/>
+          <w:color w:val="111827"/>
+          <w:spacing w:val="8"/>
+          <w:sz w:val="21"/>
+          <w:szCs w:val="21"/>
+        </w:rPr>
         <w:t xml:space="preserve">6)  GERICHTSSTAND</w:t>
       </w:r>
     </w:p>

</xml_diff>

<commit_message>
﻿Add Mahnung, Gutschrift, Abnahmeprotokoll and Wartungsvertrag templates
Four more Word templates from the shared generator (same letterhead,
gold accents, page footer): reminder letter with amount summary, credit/
cancellation note referencing the original invoice, acceptance protocol
with findings checkboxes and signatures, and a maintenance/SLA contract
with an SLA response-time table, term/notice, liability and signatures.
Header title size is configurable; signature spacing tightened. CI guide
lists all eight templates.

Co-Authored-By: Claude Opus 4.8 <noreply@anthropic.com>
</commit_message>
<xml_diff>
--- a/templates/Ferrion-Angebotsvorlage.docx
+++ b/templates/Ferrion-Angebotsvorlage.docx
@@ -2420,7 +2420,7 @@
               <w:pBdr>
                 <w:bottom w:val="single" w:color="9CA3AF" w:sz="6" w:space="20"/>
               </w:pBdr>
-              <w:spacing w:before="380"/>
+              <w:spacing w:before="300"/>
             </w:pPr>
             <w:r>
               <w:rPr>
@@ -2448,7 +2448,7 @@
               <w:pBdr>
                 <w:bottom w:val="single" w:color="9CA3AF" w:sz="6" w:space="20"/>
               </w:pBdr>
-              <w:spacing w:before="380"/>
+              <w:spacing w:before="300"/>
             </w:pPr>
             <w:r>
               <w:rPr>
@@ -2493,7 +2493,7 @@
               <w:pBdr>
                 <w:bottom w:val="single" w:color="9CA3AF" w:sz="6" w:space="20"/>
               </w:pBdr>
-              <w:spacing w:before="380"/>
+              <w:spacing w:before="300"/>
             </w:pPr>
             <w:r>
               <w:rPr>
@@ -2521,7 +2521,7 @@
               <w:pBdr>
                 <w:bottom w:val="single" w:color="9CA3AF" w:sz="6" w:space="20"/>
               </w:pBdr>
-              <w:spacing w:before="380"/>
+              <w:spacing w:before="300"/>
             </w:pPr>
             <w:r>
               <w:rPr>

</xml_diff>

<commit_message>
﻿Restructure quote template into sales part + legal annex
Part A (pages 1-2) now sells: customer situation & goal, solution
proposal, why-Ferrion section with personal contact person, prices,
and the order/signature section with timing anchor and electronic
order note - so the signature no longer sits behind two pages of
legal text. Part B moves AGB + AVV + payment terms + jurisdiction +
final clauses into Anlage 1 (page break, own A-x numbering, integral
part of the offer by reference).

New placeholders: customer_situation, customer_goal, reference_project,
contact_person, contact_phone, contact_email, start_date.
CI guide updated.

Co-Authored-By: Claude Fable 5 <noreply@anthropic.com>
</commit_message>
<xml_diff>
--- a/templates/Ferrion-Angebotsvorlage.docx
+++ b/templates/Ferrion-Angebotsvorlage.docx
@@ -736,7 +736,7 @@
           <w:sz w:val="21"/>
           <w:szCs w:val="21"/>
         </w:rPr>
-        <w:t xml:space="preserve">PRÄAMBEL</w:t>
+        <w:t xml:space="preserve">1)  IHRE AUSGANGSLAGE &amp; ZIELSETZUNG</w:t>
       </w:r>
     </w:p>
     <w:p>
@@ -751,7 +751,7 @@
           <w:sz w:val="16"/>
           <w:szCs w:val="16"/>
         </w:rPr>
-        <w:t xml:space="preserve">Ferrion IT Systemhaus GmbH (nachfolgend „Auftragnehmer“) erbringt Leistungen in den Bereichen IT-Infrastruktur, Storage, Backup &amp; Security, AI-Infrastruktur sowie Managed Services. Das vorliegende Angebot richtet sich an {customer_company} (nachfolgend „Auftraggeber“).</w:t>
+        <w:t xml:space="preserve">Ausgangslage: {customer_situation}</w:t>
       </w:r>
     </w:p>
     <w:p>
@@ -766,7 +766,7 @@
           <w:sz w:val="16"/>
           <w:szCs w:val="16"/>
         </w:rPr>
-        <w:t xml:space="preserve">Es beschreibt den angebotenen Leistungsumfang samt Preisen und bildet gemeinsam mit den nachstehenden Bestimmungen die Grundlage einer allfälligen Beauftragung. Mit der Auftragserteilung (Punkt 8) gelten die in diesem Dokument enthaltenen Bedingungen als vereinbart.</w:t>
+        <w:t xml:space="preserve">Zielsetzung: {customer_goal}</w:t>
       </w:r>
     </w:p>
     <w:p>
@@ -786,7 +786,269 @@
           <w:sz w:val="21"/>
           <w:szCs w:val="21"/>
         </w:rPr>
-        <w:t xml:space="preserve">1)  ANGEBOTSDATEN &amp; PREISE</w:t>
+        <w:t xml:space="preserve">2)  UNSER LÖSUNGSVORSCHLAG</w:t>
+      </w:r>
+    </w:p>
+    <w:p>
+      <w:pPr>
+        <w:spacing w:after="70"/>
+        <w:jc w:val="both"/>
+      </w:pPr>
+      <w:r>
+        <w:rPr>
+          <w:rFonts w:ascii="Arial" w:cs="Arial" w:eastAsia="Arial" w:hAnsi="Arial"/>
+          <w:color w:val="374151"/>
+          <w:sz w:val="16"/>
+          <w:szCs w:val="16"/>
+        </w:rPr>
+        <w:t xml:space="preserve">{service_description}</w:t>
+      </w:r>
+    </w:p>
+    <w:p>
+      <w:pPr>
+        <w:spacing w:after="30"/>
+        <w:ind w:left="220"/>
+      </w:pPr>
+      <w:r>
+        <w:rPr>
+          <w:rFonts w:ascii="Arial" w:cs="Arial" w:eastAsia="Arial" w:hAnsi="Arial"/>
+          <w:color w:val="C9A84C"/>
+          <w:sz w:val="16"/>
+          <w:szCs w:val="16"/>
+        </w:rPr>
+        <w:t xml:space="preserve">▸  </w:t>
+      </w:r>
+      <w:r>
+        <w:rPr>
+          <w:rFonts w:ascii="Arial" w:cs="Arial" w:eastAsia="Arial" w:hAnsi="Arial"/>
+          <w:color w:val="374151"/>
+          <w:sz w:val="16"/>
+          <w:szCs w:val="16"/>
+        </w:rPr>
+        <w:t xml:space="preserve">Lieferung, Installation und Inbetriebnahme der angebotenen Infrastruktur</w:t>
+      </w:r>
+    </w:p>
+    <w:p>
+      <w:pPr>
+        <w:spacing w:after="30"/>
+        <w:ind w:left="220"/>
+      </w:pPr>
+      <w:r>
+        <w:rPr>
+          <w:rFonts w:ascii="Arial" w:cs="Arial" w:eastAsia="Arial" w:hAnsi="Arial"/>
+          <w:color w:val="C9A84C"/>
+          <w:sz w:val="16"/>
+          <w:szCs w:val="16"/>
+        </w:rPr>
+        <w:t xml:space="preserve">▸  </w:t>
+      </w:r>
+      <w:r>
+        <w:rPr>
+          <w:rFonts w:ascii="Arial" w:cs="Arial" w:eastAsia="Arial" w:hAnsi="Arial"/>
+          <w:color w:val="374151"/>
+          <w:sz w:val="16"/>
+          <w:szCs w:val="16"/>
+        </w:rPr>
+        <w:t xml:space="preserve">Konfiguration, Integration sowie Migration bestehender Systeme und Daten</w:t>
+      </w:r>
+    </w:p>
+    <w:p>
+      <w:pPr>
+        <w:spacing w:after="30"/>
+        <w:ind w:left="220"/>
+      </w:pPr>
+      <w:r>
+        <w:rPr>
+          <w:rFonts w:ascii="Arial" w:cs="Arial" w:eastAsia="Arial" w:hAnsi="Arial"/>
+          <w:color w:val="C9A84C"/>
+          <w:sz w:val="16"/>
+          <w:szCs w:val="16"/>
+        </w:rPr>
+        <w:t xml:space="preserve">▸  </w:t>
+      </w:r>
+      <w:r>
+        <w:rPr>
+          <w:rFonts w:ascii="Arial" w:cs="Arial" w:eastAsia="Arial" w:hAnsi="Arial"/>
+          <w:color w:val="374151"/>
+          <w:sz w:val="16"/>
+          <w:szCs w:val="16"/>
+        </w:rPr>
+        <w:t xml:space="preserve">Einschulung der Administratoren und Übergabe der technischen Dokumentation</w:t>
+      </w:r>
+    </w:p>
+    <w:p>
+      <w:pPr>
+        <w:spacing w:after="30"/>
+        <w:ind w:left="220"/>
+      </w:pPr>
+      <w:r>
+        <w:rPr>
+          <w:rFonts w:ascii="Arial" w:cs="Arial" w:eastAsia="Arial" w:hAnsi="Arial"/>
+          <w:color w:val="C9A84C"/>
+          <w:sz w:val="16"/>
+          <w:szCs w:val="16"/>
+        </w:rPr>
+        <w:t xml:space="preserve">▸  </w:t>
+      </w:r>
+      <w:r>
+        <w:rPr>
+          <w:rFonts w:ascii="Arial" w:cs="Arial" w:eastAsia="Arial" w:hAnsi="Arial"/>
+          <w:color w:val="374151"/>
+          <w:sz w:val="16"/>
+          <w:szCs w:val="16"/>
+        </w:rPr>
+        <w:t xml:space="preserve">Optionale Managed Services, Wartung und Support gemäß vereinbartem Service-Level-Agreement (SLA)</w:t>
+      </w:r>
+    </w:p>
+    <w:p>
+      <w:pPr>
+        <w:pBdr>
+          <w:bottom w:val="single" w:color="C9A84C" w:sz="8" w:space="6"/>
+        </w:pBdr>
+        <w:spacing w:after="100" w:before="340"/>
+      </w:pPr>
+      <w:r>
+        <w:rPr>
+          <w:rFonts w:ascii="Arial" w:cs="Arial" w:eastAsia="Arial" w:hAnsi="Arial"/>
+          <w:b/>
+          <w:bCs/>
+          <w:color w:val="111827"/>
+          <w:spacing w:val="8"/>
+          <w:sz w:val="21"/>
+          <w:szCs w:val="21"/>
+        </w:rPr>
+        <w:t xml:space="preserve">3)  WARUM FERRION</w:t>
+      </w:r>
+    </w:p>
+    <w:p>
+      <w:pPr>
+        <w:spacing w:after="30"/>
+        <w:ind w:left="220"/>
+      </w:pPr>
+      <w:r>
+        <w:rPr>
+          <w:rFonts w:ascii="Arial" w:cs="Arial" w:eastAsia="Arial" w:hAnsi="Arial"/>
+          <w:color w:val="C9A84C"/>
+          <w:sz w:val="16"/>
+          <w:szCs w:val="16"/>
+        </w:rPr>
+        <w:t xml:space="preserve">▸  </w:t>
+      </w:r>
+      <w:r>
+        <w:rPr>
+          <w:rFonts w:ascii="Arial" w:cs="Arial" w:eastAsia="Arial" w:hAnsi="Arial"/>
+          <w:color w:val="374151"/>
+          <w:sz w:val="16"/>
+          <w:szCs w:val="16"/>
+        </w:rPr>
+        <w:t xml:space="preserve">Datenbank-Expertise, die im klassischen Systemhaus selten ist — wir denken in Workloads, nicht in Boxen</w:t>
+      </w:r>
+    </w:p>
+    <w:p>
+      <w:pPr>
+        <w:spacing w:after="30"/>
+        <w:ind w:left="220"/>
+      </w:pPr>
+      <w:r>
+        <w:rPr>
+          <w:rFonts w:ascii="Arial" w:cs="Arial" w:eastAsia="Arial" w:hAnsi="Arial"/>
+          <w:color w:val="C9A84C"/>
+          <w:sz w:val="16"/>
+          <w:szCs w:val="16"/>
+        </w:rPr>
+        <w:t xml:space="preserve">▸  </w:t>
+      </w:r>
+      <w:r>
+        <w:rPr>
+          <w:rFonts w:ascii="Arial" w:cs="Arial" w:eastAsia="Arial" w:hAnsi="Arial"/>
+          <w:color w:val="374151"/>
+          <w:sz w:val="16"/>
+          <w:szCs w:val="16"/>
+        </w:rPr>
+        <w:t xml:space="preserve">Zertifizierter Partner von Huawei, Pure Storage und Commvault; NVIDIA-Infrastruktur für AI-Workloads</w:t>
+      </w:r>
+    </w:p>
+    <w:p>
+      <w:pPr>
+        <w:spacing w:after="30"/>
+        <w:ind w:left="220"/>
+      </w:pPr>
+      <w:r>
+        <w:rPr>
+          <w:rFonts w:ascii="Arial" w:cs="Arial" w:eastAsia="Arial" w:hAnsi="Arial"/>
+          <w:color w:val="C9A84C"/>
+          <w:sz w:val="16"/>
+          <w:szCs w:val="16"/>
+        </w:rPr>
+        <w:t xml:space="preserve">▸  </w:t>
+      </w:r>
+      <w:r>
+        <w:rPr>
+          <w:rFonts w:ascii="Arial" w:cs="Arial" w:eastAsia="Arial" w:hAnsi="Arial"/>
+          <w:color w:val="374151"/>
+          <w:sz w:val="16"/>
+          <w:szCs w:val="16"/>
+        </w:rPr>
+        <w:t xml:space="preserve">Bewährtes Migrations-Playbook — zuletzt 500 TB mit null Minuten ungeplanter Downtime</w:t>
+      </w:r>
+    </w:p>
+    <w:p>
+      <w:pPr>
+        <w:spacing w:after="30"/>
+        <w:ind w:left="220"/>
+      </w:pPr>
+      <w:r>
+        <w:rPr>
+          <w:rFonts w:ascii="Arial" w:cs="Arial" w:eastAsia="Arial" w:hAnsi="Arial"/>
+          <w:color w:val="C9A84C"/>
+          <w:sz w:val="16"/>
+          <w:szCs w:val="16"/>
+        </w:rPr>
+        <w:t xml:space="preserve">▸  </w:t>
+      </w:r>
+      <w:r>
+        <w:rPr>
+          <w:rFonts w:ascii="Arial" w:cs="Arial" w:eastAsia="Arial" w:hAnsi="Arial"/>
+          <w:color w:val="374151"/>
+          <w:sz w:val="16"/>
+          <w:szCs w:val="16"/>
+        </w:rPr>
+        <w:t xml:space="preserve">Referenzprojekt: {reference_project}</w:t>
+      </w:r>
+    </w:p>
+    <w:p>
+      <w:pPr>
+        <w:spacing w:after="70"/>
+        <w:jc w:val="both"/>
+      </w:pPr>
+      <w:r>
+        <w:rPr>
+          <w:rFonts w:ascii="Arial" w:cs="Arial" w:eastAsia="Arial" w:hAnsi="Arial"/>
+          <w:color w:val="374151"/>
+          <w:sz w:val="16"/>
+          <w:szCs w:val="16"/>
+        </w:rPr>
+        <w:t xml:space="preserve">Ihr persönlicher Ansprechpartner für dieses Angebot: {contact_person}, {contact_phone}, {contact_email}.</w:t>
+      </w:r>
+    </w:p>
+    <w:p>
+      <w:pPr>
+        <w:pBdr>
+          <w:bottom w:val="single" w:color="C9A84C" w:sz="8" w:space="6"/>
+        </w:pBdr>
+        <w:spacing w:after="100" w:before="340"/>
+      </w:pPr>
+      <w:r>
+        <w:rPr>
+          <w:rFonts w:ascii="Arial" w:cs="Arial" w:eastAsia="Arial" w:hAnsi="Arial"/>
+          <w:b/>
+          <w:bCs/>
+          <w:color w:val="111827"/>
+          <w:spacing w:val="8"/>
+          <w:sz w:val="21"/>
+          <w:szCs w:val="21"/>
+        </w:rPr>
+        <w:t xml:space="preserve">4)  ANGEBOTSDATEN &amp; PREISE</w:t>
       </w:r>
     </w:p>
     <w:p>
@@ -1469,7 +1731,7 @@
           <w:sz w:val="21"/>
           <w:szCs w:val="21"/>
         </w:rPr>
-        <w:t xml:space="preserve">2)  LEISTUNGSBESCHREIBUNG</w:t>
+        <w:t xml:space="preserve">5)  AUFTRAGSERTEILUNG</w:t>
       </w:r>
     </w:p>
     <w:p>
@@ -1484,7 +1746,7 @@
           <w:sz w:val="16"/>
           <w:szCs w:val="16"/>
         </w:rPr>
-        <w:t xml:space="preserve">Der Auftragnehmer erbringt für den Auftraggeber die nachstehend beschriebenen Leistungen. Ergänzende oder abweichende Leistungen bedürfen einer gesonderten schriftlichen Vereinbarung.</w:t>
+        <w:t xml:space="preserve">Der Auftraggeber erteilt hiermit den Auftrag zu den vorstehenden Leistungen und Preisen. Ergänzend gelten die Bestimmungen der Anlage 1 (Allgemeine Bestimmungen &amp; Auftragsverarbeitungsvereinbarung) als vereinbart.</w:t>
       </w:r>
     </w:p>
     <w:p>
@@ -1499,810 +1761,7 @@
           <w:sz w:val="16"/>
           <w:szCs w:val="16"/>
         </w:rPr>
-        <w:t xml:space="preserve">{service_description}</w:t>
-      </w:r>
-    </w:p>
-    <w:p>
-      <w:pPr>
-        <w:spacing w:after="30"/>
-        <w:ind w:left="220"/>
-      </w:pPr>
-      <w:r>
-        <w:rPr>
-          <w:rFonts w:ascii="Arial" w:cs="Arial" w:eastAsia="Arial" w:hAnsi="Arial"/>
-          <w:color w:val="C9A84C"/>
-          <w:sz w:val="16"/>
-          <w:szCs w:val="16"/>
-        </w:rPr>
-        <w:t xml:space="preserve">▸  </w:t>
-      </w:r>
-      <w:r>
-        <w:rPr>
-          <w:rFonts w:ascii="Arial" w:cs="Arial" w:eastAsia="Arial" w:hAnsi="Arial"/>
-          <w:color w:val="374151"/>
-          <w:sz w:val="16"/>
-          <w:szCs w:val="16"/>
-        </w:rPr>
-        <w:t xml:space="preserve">Lieferung, Installation und Inbetriebnahme der angebotenen Infrastruktur</w:t>
-      </w:r>
-    </w:p>
-    <w:p>
-      <w:pPr>
-        <w:spacing w:after="30"/>
-        <w:ind w:left="220"/>
-      </w:pPr>
-      <w:r>
-        <w:rPr>
-          <w:rFonts w:ascii="Arial" w:cs="Arial" w:eastAsia="Arial" w:hAnsi="Arial"/>
-          <w:color w:val="C9A84C"/>
-          <w:sz w:val="16"/>
-          <w:szCs w:val="16"/>
-        </w:rPr>
-        <w:t xml:space="preserve">▸  </w:t>
-      </w:r>
-      <w:r>
-        <w:rPr>
-          <w:rFonts w:ascii="Arial" w:cs="Arial" w:eastAsia="Arial" w:hAnsi="Arial"/>
-          <w:color w:val="374151"/>
-          <w:sz w:val="16"/>
-          <w:szCs w:val="16"/>
-        </w:rPr>
-        <w:t xml:space="preserve">Konfiguration, Integration sowie Migration bestehender Systeme und Daten</w:t>
-      </w:r>
-    </w:p>
-    <w:p>
-      <w:pPr>
-        <w:spacing w:after="30"/>
-        <w:ind w:left="220"/>
-      </w:pPr>
-      <w:r>
-        <w:rPr>
-          <w:rFonts w:ascii="Arial" w:cs="Arial" w:eastAsia="Arial" w:hAnsi="Arial"/>
-          <w:color w:val="C9A84C"/>
-          <w:sz w:val="16"/>
-          <w:szCs w:val="16"/>
-        </w:rPr>
-        <w:t xml:space="preserve">▸  </w:t>
-      </w:r>
-      <w:r>
-        <w:rPr>
-          <w:rFonts w:ascii="Arial" w:cs="Arial" w:eastAsia="Arial" w:hAnsi="Arial"/>
-          <w:color w:val="374151"/>
-          <w:sz w:val="16"/>
-          <w:szCs w:val="16"/>
-        </w:rPr>
-        <w:t xml:space="preserve">Einschulung der Administratoren und Übergabe der technischen Dokumentation</w:t>
-      </w:r>
-    </w:p>
-    <w:p>
-      <w:pPr>
-        <w:spacing w:after="30"/>
-        <w:ind w:left="220"/>
-      </w:pPr>
-      <w:r>
-        <w:rPr>
-          <w:rFonts w:ascii="Arial" w:cs="Arial" w:eastAsia="Arial" w:hAnsi="Arial"/>
-          <w:color w:val="C9A84C"/>
-          <w:sz w:val="16"/>
-          <w:szCs w:val="16"/>
-        </w:rPr>
-        <w:t xml:space="preserve">▸  </w:t>
-      </w:r>
-      <w:r>
-        <w:rPr>
-          <w:rFonts w:ascii="Arial" w:cs="Arial" w:eastAsia="Arial" w:hAnsi="Arial"/>
-          <w:color w:val="374151"/>
-          <w:sz w:val="16"/>
-          <w:szCs w:val="16"/>
-        </w:rPr>
-        <w:t xml:space="preserve">Optionale Managed Services, Wartung und Support gemäß vereinbartem Service-Level-Agreement (SLA)</w:t>
-      </w:r>
-    </w:p>
-    <w:p>
-      <w:pPr>
-        <w:pBdr>
-          <w:bottom w:val="single" w:color="C9A84C" w:sz="8" w:space="6"/>
-        </w:pBdr>
-        <w:spacing w:after="100" w:before="340"/>
-      </w:pPr>
-      <w:r>
-        <w:rPr>
-          <w:rFonts w:ascii="Arial" w:cs="Arial" w:eastAsia="Arial" w:hAnsi="Arial"/>
-          <w:b/>
-          <w:bCs/>
-          <w:color w:val="111827"/>
-          <w:spacing w:val="8"/>
-          <w:sz w:val="21"/>
-          <w:szCs w:val="21"/>
-        </w:rPr>
-        <w:t xml:space="preserve">3)  ALLGEMEINE BESTIMMUNGEN</w:t>
-      </w:r>
-    </w:p>
-    <w:p>
-      <w:pPr>
-        <w:spacing w:after="40" w:before="180"/>
-      </w:pPr>
-      <w:r>
-        <w:rPr>
-          <w:rFonts w:ascii="Arial" w:cs="Arial" w:eastAsia="Arial" w:hAnsi="Arial"/>
-          <w:b/>
-          <w:bCs/>
-          <w:color w:val="111827"/>
-          <w:sz w:val="17"/>
-          <w:szCs w:val="17"/>
-        </w:rPr>
-        <w:t xml:space="preserve">3.1  Rücktrittsrecht</w:t>
-      </w:r>
-    </w:p>
-    <w:p>
-      <w:pPr>
-        <w:spacing w:after="70"/>
-        <w:jc w:val="both"/>
-      </w:pPr>
-      <w:r>
-        <w:rPr>
-          <w:rFonts w:ascii="Arial" w:cs="Arial" w:eastAsia="Arial" w:hAnsi="Arial"/>
-          <w:color w:val="374151"/>
-          <w:sz w:val="16"/>
-          <w:szCs w:val="16"/>
-        </w:rPr>
-        <w:t xml:space="preserve">Ist der Auftraggeber Unternehmer im Sinne des UGB, besteht kein gesetzliches Rücktritts- bzw. Widerrufsrecht. Ein einvernehmlicher Rücktritt ist bis zum Beginn der Leistungserbringung gegen Ersatz der bis dahin angefallenen Aufwände und getätigten Bestellungen möglich.</w:t>
-      </w:r>
-    </w:p>
-    <w:p>
-      <w:pPr>
-        <w:spacing w:after="40" w:before="180"/>
-      </w:pPr>
-      <w:r>
-        <w:rPr>
-          <w:rFonts w:ascii="Arial" w:cs="Arial" w:eastAsia="Arial" w:hAnsi="Arial"/>
-          <w:b/>
-          <w:bCs/>
-          <w:color w:val="111827"/>
-          <w:sz w:val="17"/>
-          <w:szCs w:val="17"/>
-        </w:rPr>
-        <w:t xml:space="preserve">3.2  Gewährleistung, Wartung, Änderungen</w:t>
-      </w:r>
-    </w:p>
-    <w:p>
-      <w:pPr>
-        <w:spacing w:after="70"/>
-        <w:jc w:val="both"/>
-      </w:pPr>
-      <w:r>
-        <w:rPr>
-          <w:rFonts w:ascii="Arial" w:cs="Arial" w:eastAsia="Arial" w:hAnsi="Arial"/>
-          <w:color w:val="374151"/>
-          <w:sz w:val="16"/>
-          <w:szCs w:val="16"/>
-        </w:rPr>
-        <w:t xml:space="preserve">Es gelten die gesetzlichen Gewährleistungsbestimmungen. Wartungs- und Supportleistungen richten sich nach dem jeweils vereinbarten SLA. Änderungen des Leistungsumfangs (Change Requests) bedürfen der Schriftform und werden nach Aufwand oder gesonderter Vereinbarung verrechnet.</w:t>
-      </w:r>
-    </w:p>
-    <w:p>
-      <w:pPr>
-        <w:spacing w:after="40" w:before="180"/>
-      </w:pPr>
-      <w:r>
-        <w:rPr>
-          <w:rFonts w:ascii="Arial" w:cs="Arial" w:eastAsia="Arial" w:hAnsi="Arial"/>
-          <w:b/>
-          <w:bCs/>
-          <w:color w:val="111827"/>
-          <w:sz w:val="17"/>
-          <w:szCs w:val="17"/>
-        </w:rPr>
-        <w:t xml:space="preserve">3.3  Haftung</w:t>
-      </w:r>
-    </w:p>
-    <w:p>
-      <w:pPr>
-        <w:spacing w:after="70"/>
-        <w:jc w:val="both"/>
-      </w:pPr>
-      <w:r>
-        <w:rPr>
-          <w:rFonts w:ascii="Arial" w:cs="Arial" w:eastAsia="Arial" w:hAnsi="Arial"/>
-          <w:color w:val="374151"/>
-          <w:sz w:val="16"/>
-          <w:szCs w:val="16"/>
-        </w:rPr>
-        <w:t xml:space="preserve">Der Auftragnehmer haftet nur für Vorsatz und grobe Fahrlässigkeit; die Haftung für leichte Fahrlässigkeit ist – soweit gesetzlich zulässig – ausgeschlossen. Die Haftung ist der Höhe nach mit dem Netto-Auftragswert begrenzt. Für Datenverlust haftet der Auftragnehmer nur, sofern der Auftraggeber eine dem Stand der Technik entsprechende Datensicherung sichergestellt hat.</w:t>
-      </w:r>
-    </w:p>
-    <w:p>
-      <w:pPr>
-        <w:spacing w:after="40" w:before="180"/>
-      </w:pPr>
-      <w:r>
-        <w:rPr>
-          <w:rFonts w:ascii="Arial" w:cs="Arial" w:eastAsia="Arial" w:hAnsi="Arial"/>
-          <w:b/>
-          <w:bCs/>
-          <w:color w:val="111827"/>
-          <w:sz w:val="17"/>
-          <w:szCs w:val="17"/>
-        </w:rPr>
-        <w:t xml:space="preserve">3.4  Urheberrecht und Nutzung</w:t>
-      </w:r>
-    </w:p>
-    <w:p>
-      <w:pPr>
-        <w:spacing w:after="70"/>
-        <w:jc w:val="both"/>
-      </w:pPr>
-      <w:r>
-        <w:rPr>
-          <w:rFonts w:ascii="Arial" w:cs="Arial" w:eastAsia="Arial" w:hAnsi="Arial"/>
-          <w:color w:val="374151"/>
-          <w:sz w:val="16"/>
-          <w:szCs w:val="16"/>
-        </w:rPr>
-        <w:t xml:space="preserve">Konzepte, Dokumentationen sowie individuell erstellte Software und Konfigurationen bleiben bis zur vollständigen Bezahlung im Eigentum des Auftragnehmers. Der Auftraggeber erhält daran ein nicht ausschließliches, nicht übertragbares Nutzungsrecht für den vereinbarten Einsatzzweck.</w:t>
-      </w:r>
-    </w:p>
-    <w:p>
-      <w:pPr>
-        <w:spacing w:after="40" w:before="180"/>
-      </w:pPr>
-      <w:r>
-        <w:rPr>
-          <w:rFonts w:ascii="Arial" w:cs="Arial" w:eastAsia="Arial" w:hAnsi="Arial"/>
-          <w:b/>
-          <w:bCs/>
-          <w:color w:val="111827"/>
-          <w:sz w:val="17"/>
-          <w:szCs w:val="17"/>
-        </w:rPr>
-        <w:t xml:space="preserve">3.5  Loyalität</w:t>
-      </w:r>
-    </w:p>
-    <w:p>
-      <w:pPr>
-        <w:spacing w:after="70"/>
-        <w:jc w:val="both"/>
-      </w:pPr>
-      <w:r>
-        <w:rPr>
-          <w:rFonts w:ascii="Arial" w:cs="Arial" w:eastAsia="Arial" w:hAnsi="Arial"/>
-          <w:color w:val="374151"/>
-          <w:sz w:val="16"/>
-          <w:szCs w:val="16"/>
-        </w:rPr>
-        <w:t xml:space="preserve">Die Vertragspartner verpflichten sich, während der Dauer der Zusammenarbeit sowie für zwölf Monate danach keine Mitarbeiter des jeweils anderen Vertragspartners aktiv abzuwerben.</w:t>
-      </w:r>
-    </w:p>
-    <w:p>
-      <w:pPr>
-        <w:spacing w:after="40" w:before="180"/>
-      </w:pPr>
-      <w:r>
-        <w:rPr>
-          <w:rFonts w:ascii="Arial" w:cs="Arial" w:eastAsia="Arial" w:hAnsi="Arial"/>
-          <w:b/>
-          <w:bCs/>
-          <w:color w:val="111827"/>
-          <w:sz w:val="17"/>
-          <w:szCs w:val="17"/>
-        </w:rPr>
-        <w:t xml:space="preserve">3.6  Datenschutz und Geheimhaltung</w:t>
-      </w:r>
-    </w:p>
-    <w:p>
-      <w:pPr>
-        <w:spacing w:after="70"/>
-        <w:jc w:val="both"/>
-      </w:pPr>
-      <w:r>
-        <w:rPr>
-          <w:rFonts w:ascii="Arial" w:cs="Arial" w:eastAsia="Arial" w:hAnsi="Arial"/>
-          <w:color w:val="374151"/>
-          <w:sz w:val="16"/>
-          <w:szCs w:val="16"/>
-        </w:rPr>
-        <w:t xml:space="preserve">Die Vertragspartner behandeln alle im Rahmen der Zusammenarbeit erlangten, nicht offenkundigen Informationen vertraulich. Die Verarbeitung personenbezogener Daten erfolgt nach der DSGVO; Näheres regelt die Auftragsverarbeitungsvereinbarung in Punkt 4.</w:t>
-      </w:r>
-    </w:p>
-    <w:p>
-      <w:pPr>
-        <w:pBdr>
-          <w:bottom w:val="single" w:color="C9A84C" w:sz="8" w:space="6"/>
-        </w:pBdr>
-        <w:spacing w:after="100" w:before="340"/>
-      </w:pPr>
-      <w:r>
-        <w:rPr>
-          <w:rFonts w:ascii="Arial" w:cs="Arial" w:eastAsia="Arial" w:hAnsi="Arial"/>
-          <w:b/>
-          <w:bCs/>
-          <w:color w:val="111827"/>
-          <w:spacing w:val="8"/>
-          <w:sz w:val="21"/>
-          <w:szCs w:val="21"/>
-        </w:rPr>
-        <w:t xml:space="preserve">4)  AUFTRAGSVERARBEITUNGSVEREINBARUNG</w:t>
-      </w:r>
-    </w:p>
-    <w:p>
-      <w:pPr>
-        <w:spacing w:after="70"/>
-        <w:jc w:val="both"/>
-      </w:pPr>
-      <w:r>
-        <w:rPr>
-          <w:rFonts w:ascii="Arial" w:cs="Arial" w:eastAsia="Arial" w:hAnsi="Arial"/>
-          <w:color w:val="374151"/>
-          <w:sz w:val="16"/>
-          <w:szCs w:val="16"/>
-        </w:rPr>
-        <w:t xml:space="preserve">Soweit der Auftragnehmer im Rahmen der Leistungserbringung personenbezogene Daten im Auftrag des Auftraggebers verarbeitet, gilt ergänzend die nachstehende Vereinbarung gemäß Art 28 DSGVO.</w:t>
-      </w:r>
-    </w:p>
-    <w:p>
-      <w:pPr>
-        <w:spacing w:after="40" w:before="180"/>
-      </w:pPr>
-      <w:r>
-        <w:rPr>
-          <w:rFonts w:ascii="Arial" w:cs="Arial" w:eastAsia="Arial" w:hAnsi="Arial"/>
-          <w:b/>
-          <w:bCs/>
-          <w:color w:val="111827"/>
-          <w:sz w:val="17"/>
-          <w:szCs w:val="17"/>
-        </w:rPr>
-        <w:t xml:space="preserve">4.1  Weisungsrecht</w:t>
-      </w:r>
-    </w:p>
-    <w:p>
-      <w:pPr>
-        <w:spacing w:after="70"/>
-        <w:jc w:val="both"/>
-      </w:pPr>
-      <w:r>
-        <w:rPr>
-          <w:rFonts w:ascii="Arial" w:cs="Arial" w:eastAsia="Arial" w:hAnsi="Arial"/>
-          <w:color w:val="374151"/>
-          <w:sz w:val="16"/>
-          <w:szCs w:val="16"/>
-        </w:rPr>
-        <w:t xml:space="preserve">Der Auftragnehmer verarbeitet personenbezogene Daten ausschließlich auf dokumentierte Weisung des Auftraggebers, es sei denn, er ist gesetzlich zur Verarbeitung verpflichtet.</w:t>
-      </w:r>
-    </w:p>
-    <w:p>
-      <w:pPr>
-        <w:spacing w:after="40" w:before="180"/>
-      </w:pPr>
-      <w:r>
-        <w:rPr>
-          <w:rFonts w:ascii="Arial" w:cs="Arial" w:eastAsia="Arial" w:hAnsi="Arial"/>
-          <w:b/>
-          <w:bCs/>
-          <w:color w:val="111827"/>
-          <w:sz w:val="17"/>
-          <w:szCs w:val="17"/>
-        </w:rPr>
-        <w:t xml:space="preserve">4.2  Vertraulichkeit</w:t>
-      </w:r>
-    </w:p>
-    <w:p>
-      <w:pPr>
-        <w:spacing w:after="70"/>
-        <w:jc w:val="both"/>
-      </w:pPr>
-      <w:r>
-        <w:rPr>
-          <w:rFonts w:ascii="Arial" w:cs="Arial" w:eastAsia="Arial" w:hAnsi="Arial"/>
-          <w:color w:val="374151"/>
-          <w:sz w:val="16"/>
-          <w:szCs w:val="16"/>
-        </w:rPr>
-        <w:t xml:space="preserve">Der Auftragnehmer stellt sicher, dass die zur Verarbeitung befugten Personen zur Vertraulichkeit verpflichtet sind oder einer angemessenen gesetzlichen Verschwiegenheitspflicht unterliegen.</w:t>
-      </w:r>
-    </w:p>
-    <w:p>
-      <w:pPr>
-        <w:spacing w:after="40" w:before="180"/>
-      </w:pPr>
-      <w:r>
-        <w:rPr>
-          <w:rFonts w:ascii="Arial" w:cs="Arial" w:eastAsia="Arial" w:hAnsi="Arial"/>
-          <w:b/>
-          <w:bCs/>
-          <w:color w:val="111827"/>
-          <w:sz w:val="17"/>
-          <w:szCs w:val="17"/>
-        </w:rPr>
-        <w:t xml:space="preserve">4.3  Datensicherheit</w:t>
-      </w:r>
-    </w:p>
-    <w:p>
-      <w:pPr>
-        <w:spacing w:after="70"/>
-        <w:jc w:val="both"/>
-      </w:pPr>
-      <w:r>
-        <w:rPr>
-          <w:rFonts w:ascii="Arial" w:cs="Arial" w:eastAsia="Arial" w:hAnsi="Arial"/>
-          <w:color w:val="374151"/>
-          <w:sz w:val="16"/>
-          <w:szCs w:val="16"/>
-        </w:rPr>
-        <w:t xml:space="preserve">Der Auftragnehmer trifft geeignete technische und organisatorische Maßnahmen gemäß Art 32 DSGVO – insbesondere Verschlüsselung, Zutritts- und Zugriffskontrolle, Datensicherung sowie Protokollierung – und passt diese dem Stand der Technik an.</w:t>
-      </w:r>
-    </w:p>
-    <w:p>
-      <w:pPr>
-        <w:spacing w:after="40" w:before="180"/>
-      </w:pPr>
-      <w:r>
-        <w:rPr>
-          <w:rFonts w:ascii="Arial" w:cs="Arial" w:eastAsia="Arial" w:hAnsi="Arial"/>
-          <w:b/>
-          <w:bCs/>
-          <w:color w:val="111827"/>
-          <w:sz w:val="17"/>
-          <w:szCs w:val="17"/>
-        </w:rPr>
-        <w:t xml:space="preserve">4.4  Sub-Auftragsverarbeitung</w:t>
-      </w:r>
-    </w:p>
-    <w:p>
-      <w:pPr>
-        <w:spacing w:after="70"/>
-        <w:jc w:val="both"/>
-      </w:pPr>
-      <w:r>
-        <w:rPr>
-          <w:rFonts w:ascii="Arial" w:cs="Arial" w:eastAsia="Arial" w:hAnsi="Arial"/>
-          <w:color w:val="374151"/>
-          <w:sz w:val="16"/>
-          <w:szCs w:val="16"/>
-        </w:rPr>
-        <w:t xml:space="preserve">Die Beiziehung weiterer Auftragsverarbeiter erfolgt nur mit vorheriger, allgemeiner oder gesonderter Zustimmung des Auftraggebers. Der Auftragnehmer erlegt dem Sub-Auftragsverarbeiter dieselben Datenschutzpflichten auf.</w:t>
-      </w:r>
-    </w:p>
-    <w:p>
-      <w:pPr>
-        <w:spacing w:after="40" w:before="180"/>
-      </w:pPr>
-      <w:r>
-        <w:rPr>
-          <w:rFonts w:ascii="Arial" w:cs="Arial" w:eastAsia="Arial" w:hAnsi="Arial"/>
-          <w:b/>
-          <w:bCs/>
-          <w:color w:val="111827"/>
-          <w:sz w:val="17"/>
-          <w:szCs w:val="17"/>
-        </w:rPr>
-        <w:t xml:space="preserve">4.5  Unterstützung</w:t>
-      </w:r>
-    </w:p>
-    <w:p>
-      <w:pPr>
-        <w:spacing w:after="70"/>
-        <w:jc w:val="both"/>
-      </w:pPr>
-      <w:r>
-        <w:rPr>
-          <w:rFonts w:ascii="Arial" w:cs="Arial" w:eastAsia="Arial" w:hAnsi="Arial"/>
-          <w:color w:val="374151"/>
-          <w:sz w:val="16"/>
-          <w:szCs w:val="16"/>
-        </w:rPr>
-        <w:t xml:space="preserve">Der Auftragnehmer unterstützt den Auftraggeber im Rahmen des Zumutbaren bei der Beantwortung von Betroffenenanfragen sowie bei der Einhaltung der Pflichten gemäß Art 32 bis 36 DSGVO (u. a. Meldung von Datenschutzverletzungen).</w:t>
-      </w:r>
-    </w:p>
-    <w:p>
-      <w:pPr>
-        <w:spacing w:after="40" w:before="180"/>
-      </w:pPr>
-      <w:r>
-        <w:rPr>
-          <w:rFonts w:ascii="Arial" w:cs="Arial" w:eastAsia="Arial" w:hAnsi="Arial"/>
-          <w:b/>
-          <w:bCs/>
-          <w:color w:val="111827"/>
-          <w:sz w:val="17"/>
-          <w:szCs w:val="17"/>
-        </w:rPr>
-        <w:t xml:space="preserve">4.6  Rückgabe von personenbezogenen Daten</w:t>
-      </w:r>
-    </w:p>
-    <w:p>
-      <w:pPr>
-        <w:spacing w:after="70"/>
-        <w:jc w:val="both"/>
-      </w:pPr>
-      <w:r>
-        <w:rPr>
-          <w:rFonts w:ascii="Arial" w:cs="Arial" w:eastAsia="Arial" w:hAnsi="Arial"/>
-          <w:color w:val="374151"/>
-          <w:sz w:val="16"/>
-          <w:szCs w:val="16"/>
-        </w:rPr>
-        <w:t xml:space="preserve">Nach Beendigung der Leistung werden sämtliche personenbezogenen Daten nach Wahl des Auftraggebers zurückgegeben oder gelöscht, sofern keine gesetzliche Aufbewahrungspflicht entgegensteht.</w:t>
-      </w:r>
-    </w:p>
-    <w:p>
-      <w:pPr>
-        <w:spacing w:after="40" w:before="180"/>
-      </w:pPr>
-      <w:r>
-        <w:rPr>
-          <w:rFonts w:ascii="Arial" w:cs="Arial" w:eastAsia="Arial" w:hAnsi="Arial"/>
-          <w:b/>
-          <w:bCs/>
-          <w:color w:val="111827"/>
-          <w:sz w:val="17"/>
-          <w:szCs w:val="17"/>
-        </w:rPr>
-        <w:t xml:space="preserve">4.7  Überprüfung</w:t>
-      </w:r>
-    </w:p>
-    <w:p>
-      <w:pPr>
-        <w:spacing w:after="70"/>
-        <w:jc w:val="both"/>
-      </w:pPr>
-      <w:r>
-        <w:rPr>
-          <w:rFonts w:ascii="Arial" w:cs="Arial" w:eastAsia="Arial" w:hAnsi="Arial"/>
-          <w:color w:val="374151"/>
-          <w:sz w:val="16"/>
-          <w:szCs w:val="16"/>
-        </w:rPr>
-        <w:t xml:space="preserve">Der Auftragnehmer stellt dem Auftraggeber alle zum Nachweis der Einhaltung erforderlichen Informationen zur Verfügung und ermöglicht angemessene Überprüfungen bzw. Audits nach vorheriger Ankündigung.</w:t>
-      </w:r>
-    </w:p>
-    <w:p>
-      <w:pPr>
-        <w:pBdr>
-          <w:bottom w:val="single" w:color="C9A84C" w:sz="8" w:space="6"/>
-        </w:pBdr>
-        <w:spacing w:after="100" w:before="340"/>
-      </w:pPr>
-      <w:r>
-        <w:rPr>
-          <w:rFonts w:ascii="Arial" w:cs="Arial" w:eastAsia="Arial" w:hAnsi="Arial"/>
-          <w:b/>
-          <w:bCs/>
-          <w:color w:val="111827"/>
-          <w:spacing w:val="8"/>
-          <w:sz w:val="21"/>
-          <w:szCs w:val="21"/>
-        </w:rPr>
-        <w:t xml:space="preserve">5)  ZAHLUNGSBEDINGUNGEN &amp; VERGÜTUNG</w:t>
-      </w:r>
-    </w:p>
-    <w:p>
-      <w:pPr>
-        <w:spacing w:after="40" w:before="180"/>
-      </w:pPr>
-      <w:r>
-        <w:rPr>
-          <w:rFonts w:ascii="Arial" w:cs="Arial" w:eastAsia="Arial" w:hAnsi="Arial"/>
-          <w:b/>
-          <w:bCs/>
-          <w:color w:val="111827"/>
-          <w:sz w:val="17"/>
-          <w:szCs w:val="17"/>
-        </w:rPr>
-        <w:t xml:space="preserve">5.1  Vergütung</w:t>
-      </w:r>
-    </w:p>
-    <w:p>
-      <w:pPr>
-        <w:spacing w:after="70"/>
-        <w:jc w:val="both"/>
-      </w:pPr>
-      <w:r>
-        <w:rPr>
-          <w:rFonts w:ascii="Arial" w:cs="Arial" w:eastAsia="Arial" w:hAnsi="Arial"/>
-          <w:color w:val="374151"/>
-          <w:sz w:val="16"/>
-          <w:szCs w:val="16"/>
-        </w:rPr>
-        <w:t xml:space="preserve">Die Vergütung richtet sich nach den in Punkt 1 angeführten Positionen. Alle Preise verstehen sich netto in {currency} zuzüglich der gesetzlichen Umsatzsteuer. Reise-, Fahrt- und Nächtigungskosten werden, sofern nicht anders vereinbart, nach tatsächlichem Aufwand verrechnet.</w:t>
-      </w:r>
-    </w:p>
-    <w:p>
-      <w:pPr>
-        <w:spacing w:after="40" w:before="180"/>
-      </w:pPr>
-      <w:r>
-        <w:rPr>
-          <w:rFonts w:ascii="Arial" w:cs="Arial" w:eastAsia="Arial" w:hAnsi="Arial"/>
-          <w:b/>
-          <w:bCs/>
-          <w:color w:val="111827"/>
-          <w:sz w:val="17"/>
-          <w:szCs w:val="17"/>
-        </w:rPr>
-        <w:t xml:space="preserve">5.2  Zahlungsbedingungen</w:t>
-      </w:r>
-    </w:p>
-    <w:p>
-      <w:pPr>
-        <w:spacing w:after="70"/>
-        <w:jc w:val="both"/>
-      </w:pPr>
-      <w:r>
-        <w:rPr>
-          <w:rFonts w:ascii="Arial" w:cs="Arial" w:eastAsia="Arial" w:hAnsi="Arial"/>
-          <w:color w:val="374151"/>
-          <w:sz w:val="16"/>
-          <w:szCs w:val="16"/>
-        </w:rPr>
-        <w:t xml:space="preserve">Rechnungen sind innerhalb von {payment_terms_days} Tagen ab Rechnungserhalt ohne Abzug zur Zahlung fällig. Bei Projekten kann der Auftragnehmer Teil- oder Anzahlungsrechnungen entsprechend dem Leistungsfortschritt legen. Bei Zahlungsverzug werden Verzugszinsen in gesetzlicher Höhe (bei unternehmerischen Geschäften 9,2 Prozentpunkte über dem Basiszinssatz) sowie angemessene Mahn- und Inkassospesen verrechnet.</w:t>
-      </w:r>
-    </w:p>
-    <w:p>
-      <w:pPr>
-        <w:spacing w:after="40" w:before="180"/>
-      </w:pPr>
-      <w:r>
-        <w:rPr>
-          <w:rFonts w:ascii="Arial" w:cs="Arial" w:eastAsia="Arial" w:hAnsi="Arial"/>
-          <w:b/>
-          <w:bCs/>
-          <w:color w:val="111827"/>
-          <w:sz w:val="17"/>
-          <w:szCs w:val="17"/>
-        </w:rPr>
-        <w:t xml:space="preserve">5.3  Lieferung &amp; Termine</w:t>
-      </w:r>
-    </w:p>
-    <w:p>
-      <w:pPr>
-        <w:spacing w:after="70"/>
-        <w:jc w:val="both"/>
-      </w:pPr>
-      <w:r>
-        <w:rPr>
-          <w:rFonts w:ascii="Arial" w:cs="Arial" w:eastAsia="Arial" w:hAnsi="Arial"/>
-          <w:color w:val="374151"/>
-          <w:sz w:val="16"/>
-          <w:szCs w:val="16"/>
-        </w:rPr>
-        <w:t xml:space="preserve">Die Leistungserbringung beginnt nach Auftragserteilung und Klärung aller technischen Voraussetzungen. Angegebene Liefer- und Leistungstermine ({service_period}) sind, sofern nicht ausdrücklich als verbindlich (Fixtermin) bezeichnet, Richtwerte. Verzögerungen aus der Sphäre des Auftraggebers oder durch höhere Gewalt verlängern die Fristen angemessen.</w:t>
-      </w:r>
-    </w:p>
-    <w:p>
-      <w:pPr>
-        <w:spacing w:after="40" w:before="180"/>
-      </w:pPr>
-      <w:r>
-        <w:rPr>
-          <w:rFonts w:ascii="Arial" w:cs="Arial" w:eastAsia="Arial" w:hAnsi="Arial"/>
-          <w:b/>
-          <w:bCs/>
-          <w:color w:val="111827"/>
-          <w:sz w:val="17"/>
-          <w:szCs w:val="17"/>
-        </w:rPr>
-        <w:t xml:space="preserve">5.4  Eigentumsvorbehalt</w:t>
-      </w:r>
-    </w:p>
-    <w:p>
-      <w:pPr>
-        <w:spacing w:after="70"/>
-        <w:jc w:val="both"/>
-      </w:pPr>
-      <w:r>
-        <w:rPr>
-          <w:rFonts w:ascii="Arial" w:cs="Arial" w:eastAsia="Arial" w:hAnsi="Arial"/>
-          <w:color w:val="374151"/>
-          <w:sz w:val="16"/>
-          <w:szCs w:val="16"/>
-        </w:rPr>
-        <w:t xml:space="preserve">Gelieferte Waren bleiben bis zur vollständigen Bezahlung sämtlicher Forderungen aus der Geschäftsbeziehung im Eigentum des Auftragnehmers.</w:t>
-      </w:r>
-    </w:p>
-    <w:p>
-      <w:pPr>
-        <w:pBdr>
-          <w:bottom w:val="single" w:color="C9A84C" w:sz="8" w:space="6"/>
-        </w:pBdr>
-        <w:spacing w:after="100" w:before="340"/>
-      </w:pPr>
-      <w:r>
-        <w:rPr>
-          <w:rFonts w:ascii="Arial" w:cs="Arial" w:eastAsia="Arial" w:hAnsi="Arial"/>
-          <w:b/>
-          <w:bCs/>
-          <w:color w:val="111827"/>
-          <w:spacing w:val="8"/>
-          <w:sz w:val="21"/>
-          <w:szCs w:val="21"/>
-        </w:rPr>
-        <w:t xml:space="preserve">6)  GERICHTSSTAND</w:t>
-      </w:r>
-    </w:p>
-    <w:p>
-      <w:pPr>
-        <w:spacing w:after="70"/>
-        <w:jc w:val="both"/>
-      </w:pPr>
-      <w:r>
-        <w:rPr>
-          <w:rFonts w:ascii="Arial" w:cs="Arial" w:eastAsia="Arial" w:hAnsi="Arial"/>
-          <w:color w:val="374151"/>
-          <w:sz w:val="16"/>
-          <w:szCs w:val="16"/>
-        </w:rPr>
-        <w:t xml:space="preserve">Es gilt österreichisches Recht unter Ausschluss der Verweisungsnormen des internationalen Privatrechts sowie des UN-Kaufrechts. Ausschließlicher Gerichtsstand für alle Streitigkeiten aus oder im Zusammenhang mit diesem Vertrag ist das sachlich zuständige Gericht in Wien.</w:t>
-      </w:r>
-    </w:p>
-    <w:p>
-      <w:pPr>
-        <w:pBdr>
-          <w:bottom w:val="single" w:color="C9A84C" w:sz="8" w:space="6"/>
-        </w:pBdr>
-        <w:spacing w:after="100" w:before="340"/>
-      </w:pPr>
-      <w:r>
-        <w:rPr>
-          <w:rFonts w:ascii="Arial" w:cs="Arial" w:eastAsia="Arial" w:hAnsi="Arial"/>
-          <w:b/>
-          <w:bCs/>
-          <w:color w:val="111827"/>
-          <w:spacing w:val="8"/>
-          <w:sz w:val="21"/>
-          <w:szCs w:val="21"/>
-        </w:rPr>
-        <w:t xml:space="preserve">7)  SCHLUSSBESTIMMUNGEN</w:t>
-      </w:r>
-    </w:p>
-    <w:p>
-      <w:pPr>
-        <w:spacing w:after="70"/>
-        <w:jc w:val="both"/>
-      </w:pPr>
-      <w:r>
-        <w:rPr>
-          <w:rFonts w:ascii="Arial" w:cs="Arial" w:eastAsia="Arial" w:hAnsi="Arial"/>
-          <w:color w:val="374151"/>
-          <w:sz w:val="16"/>
-          <w:szCs w:val="16"/>
-        </w:rPr>
-        <w:t xml:space="preserve">Änderungen und Ergänzungen bedürfen der Schriftform; dies gilt auch für ein Abgehen vom Schriftformerfordernis. Sollten einzelne Bestimmungen unwirksam sein oder werden, bleibt die Wirksamkeit der übrigen Bestimmungen unberührt (salvatorische Klausel); an die Stelle der unwirksamen Bestimmung tritt eine dem wirtschaftlichen Zweck möglichst nahekommende Regelung.</w:t>
-      </w:r>
-    </w:p>
-    <w:p>
-      <w:pPr>
-        <w:pBdr>
-          <w:bottom w:val="single" w:color="C9A84C" w:sz="8" w:space="6"/>
-        </w:pBdr>
-        <w:spacing w:after="100" w:before="340"/>
-      </w:pPr>
-      <w:r>
-        <w:rPr>
-          <w:rFonts w:ascii="Arial" w:cs="Arial" w:eastAsia="Arial" w:hAnsi="Arial"/>
-          <w:b/>
-          <w:bCs/>
-          <w:color w:val="111827"/>
-          <w:spacing w:val="8"/>
-          <w:sz w:val="21"/>
-          <w:szCs w:val="21"/>
-        </w:rPr>
-        <w:t xml:space="preserve">8)  AUFTRAGSERTEILUNG</w:t>
-      </w:r>
-    </w:p>
-    <w:p>
-      <w:pPr>
-        <w:spacing w:after="70"/>
-        <w:jc w:val="both"/>
-      </w:pPr>
-      <w:r>
-        <w:rPr>
-          <w:rFonts w:ascii="Arial" w:cs="Arial" w:eastAsia="Arial" w:hAnsi="Arial"/>
-          <w:color w:val="374151"/>
-          <w:sz w:val="16"/>
-          <w:szCs w:val="16"/>
-        </w:rPr>
-        <w:t xml:space="preserve">Der Auftraggeber erteilt hiermit den Auftrag zu den vorstehenden Leistungen, Preisen und Bedingungen.</w:t>
+        <w:t xml:space="preserve">Bei Beauftragung bis {valid_until} ist ein Umsetzungsstart ab {start_date} möglich.</w:t>
       </w:r>
     </w:p>
     <w:tbl>
@@ -2547,6 +2006,735 @@
         </w:tc>
       </w:tr>
     </w:tbl>
+    <w:p>
+      <w:r>
+        <w:br w:type="page"/>
+      </w:r>
+    </w:p>
+    <w:p>
+      <w:pPr>
+        <w:spacing w:after="20" w:before="80"/>
+      </w:pPr>
+      <w:r>
+        <w:rPr>
+          <w:rFonts w:ascii="Arial" w:cs="Arial" w:eastAsia="Arial" w:hAnsi="Arial"/>
+          <w:b/>
+          <w:bCs/>
+          <w:color w:val="C9A84C"/>
+          <w:spacing w:val="40"/>
+          <w:sz w:val="15"/>
+          <w:szCs w:val="15"/>
+        </w:rPr>
+        <w:t xml:space="preserve">ANLAGE 1</w:t>
+      </w:r>
+    </w:p>
+    <w:p>
+      <w:pPr>
+        <w:pBdr>
+          <w:bottom w:val="single" w:color="C9A84C" w:sz="8" w:space="6"/>
+        </w:pBdr>
+        <w:spacing w:after="60"/>
+      </w:pPr>
+      <w:r>
+        <w:rPr>
+          <w:rFonts w:ascii="Arial" w:cs="Arial" w:eastAsia="Arial" w:hAnsi="Arial"/>
+          <w:b/>
+          <w:bCs/>
+          <w:color w:val="111827"/>
+          <w:spacing w:val="10"/>
+          <w:sz w:val="22"/>
+          <w:szCs w:val="22"/>
+        </w:rPr>
+        <w:t xml:space="preserve">ALLGEMEINE BESTIMMUNGEN &amp; AUFTRAGSVERARBEITUNGSVEREINBARUNG</w:t>
+      </w:r>
+    </w:p>
+    <w:p>
+      <w:pPr>
+        <w:spacing w:after="70"/>
+        <w:jc w:val="both"/>
+      </w:pPr>
+      <w:r>
+        <w:rPr>
+          <w:rFonts w:ascii="Arial" w:cs="Arial" w:eastAsia="Arial" w:hAnsi="Arial"/>
+          <w:color w:val="374151"/>
+          <w:sz w:val="16"/>
+          <w:szCs w:val="16"/>
+        </w:rPr>
+        <w:t xml:space="preserve">Diese Anlage ist integraler Bestandteil des Angebots {quote_number} und gilt mit der Auftragserteilung als vereinbart.</w:t>
+      </w:r>
+    </w:p>
+    <w:p>
+      <w:pPr>
+        <w:pBdr>
+          <w:bottom w:val="single" w:color="C9A84C" w:sz="8" w:space="6"/>
+        </w:pBdr>
+        <w:spacing w:after="100" w:before="340"/>
+      </w:pPr>
+      <w:r>
+        <w:rPr>
+          <w:rFonts w:ascii="Arial" w:cs="Arial" w:eastAsia="Arial" w:hAnsi="Arial"/>
+          <w:b/>
+          <w:bCs/>
+          <w:color w:val="111827"/>
+          <w:spacing w:val="8"/>
+          <w:sz w:val="21"/>
+          <w:szCs w:val="21"/>
+        </w:rPr>
+        <w:t xml:space="preserve">A-1)  ALLGEMEINE BESTIMMUNGEN</w:t>
+      </w:r>
+    </w:p>
+    <w:p>
+      <w:pPr>
+        <w:spacing w:after="40" w:before="180"/>
+      </w:pPr>
+      <w:r>
+        <w:rPr>
+          <w:rFonts w:ascii="Arial" w:cs="Arial" w:eastAsia="Arial" w:hAnsi="Arial"/>
+          <w:b/>
+          <w:bCs/>
+          <w:color w:val="111827"/>
+          <w:sz w:val="17"/>
+          <w:szCs w:val="17"/>
+        </w:rPr>
+        <w:t xml:space="preserve">A-1.1  Rücktrittsrecht</w:t>
+      </w:r>
+    </w:p>
+    <w:p>
+      <w:pPr>
+        <w:spacing w:after="70"/>
+        <w:jc w:val="both"/>
+      </w:pPr>
+      <w:r>
+        <w:rPr>
+          <w:rFonts w:ascii="Arial" w:cs="Arial" w:eastAsia="Arial" w:hAnsi="Arial"/>
+          <w:color w:val="374151"/>
+          <w:sz w:val="16"/>
+          <w:szCs w:val="16"/>
+        </w:rPr>
+        <w:t xml:space="preserve">Ist der Auftraggeber Unternehmer im Sinne des UGB, besteht kein gesetzliches Rücktritts- bzw. Widerrufsrecht. Ein einvernehmlicher Rücktritt ist bis zum Beginn der Leistungserbringung gegen Ersatz der bis dahin angefallenen Aufwände und getätigten Bestellungen möglich.</w:t>
+      </w:r>
+    </w:p>
+    <w:p>
+      <w:pPr>
+        <w:spacing w:after="40" w:before="180"/>
+      </w:pPr>
+      <w:r>
+        <w:rPr>
+          <w:rFonts w:ascii="Arial" w:cs="Arial" w:eastAsia="Arial" w:hAnsi="Arial"/>
+          <w:b/>
+          <w:bCs/>
+          <w:color w:val="111827"/>
+          <w:sz w:val="17"/>
+          <w:szCs w:val="17"/>
+        </w:rPr>
+        <w:t xml:space="preserve">A-1.2  Gewährleistung, Wartung, Änderungen</w:t>
+      </w:r>
+    </w:p>
+    <w:p>
+      <w:pPr>
+        <w:spacing w:after="70"/>
+        <w:jc w:val="both"/>
+      </w:pPr>
+      <w:r>
+        <w:rPr>
+          <w:rFonts w:ascii="Arial" w:cs="Arial" w:eastAsia="Arial" w:hAnsi="Arial"/>
+          <w:color w:val="374151"/>
+          <w:sz w:val="16"/>
+          <w:szCs w:val="16"/>
+        </w:rPr>
+        <w:t xml:space="preserve">Es gelten die gesetzlichen Gewährleistungsbestimmungen. Wartungs- und Supportleistungen richten sich nach dem jeweils vereinbarten SLA. Änderungen des Leistungsumfangs (Change Requests) bedürfen der Schriftform und werden nach Aufwand oder gesonderter Vereinbarung verrechnet.</w:t>
+      </w:r>
+    </w:p>
+    <w:p>
+      <w:pPr>
+        <w:spacing w:after="40" w:before="180"/>
+      </w:pPr>
+      <w:r>
+        <w:rPr>
+          <w:rFonts w:ascii="Arial" w:cs="Arial" w:eastAsia="Arial" w:hAnsi="Arial"/>
+          <w:b/>
+          <w:bCs/>
+          <w:color w:val="111827"/>
+          <w:sz w:val="17"/>
+          <w:szCs w:val="17"/>
+        </w:rPr>
+        <w:t xml:space="preserve">A-1.3  Haftung</w:t>
+      </w:r>
+    </w:p>
+    <w:p>
+      <w:pPr>
+        <w:spacing w:after="70"/>
+        <w:jc w:val="both"/>
+      </w:pPr>
+      <w:r>
+        <w:rPr>
+          <w:rFonts w:ascii="Arial" w:cs="Arial" w:eastAsia="Arial" w:hAnsi="Arial"/>
+          <w:color w:val="374151"/>
+          <w:sz w:val="16"/>
+          <w:szCs w:val="16"/>
+        </w:rPr>
+        <w:t xml:space="preserve">Der Auftragnehmer haftet nur für Vorsatz und grobe Fahrlässigkeit; die Haftung für leichte Fahrlässigkeit ist – soweit gesetzlich zulässig – ausgeschlossen. Die Haftung ist der Höhe nach mit dem Netto-Auftragswert begrenzt. Für Datenverlust haftet der Auftragnehmer nur, sofern der Auftraggeber eine dem Stand der Technik entsprechende Datensicherung sichergestellt hat.</w:t>
+      </w:r>
+    </w:p>
+    <w:p>
+      <w:pPr>
+        <w:spacing w:after="40" w:before="180"/>
+      </w:pPr>
+      <w:r>
+        <w:rPr>
+          <w:rFonts w:ascii="Arial" w:cs="Arial" w:eastAsia="Arial" w:hAnsi="Arial"/>
+          <w:b/>
+          <w:bCs/>
+          <w:color w:val="111827"/>
+          <w:sz w:val="17"/>
+          <w:szCs w:val="17"/>
+        </w:rPr>
+        <w:t xml:space="preserve">A-1.4  Urheberrecht und Nutzung</w:t>
+      </w:r>
+    </w:p>
+    <w:p>
+      <w:pPr>
+        <w:spacing w:after="70"/>
+        <w:jc w:val="both"/>
+      </w:pPr>
+      <w:r>
+        <w:rPr>
+          <w:rFonts w:ascii="Arial" w:cs="Arial" w:eastAsia="Arial" w:hAnsi="Arial"/>
+          <w:color w:val="374151"/>
+          <w:sz w:val="16"/>
+          <w:szCs w:val="16"/>
+        </w:rPr>
+        <w:t xml:space="preserve">Konzepte, Dokumentationen sowie individuell erstellte Software und Konfigurationen bleiben bis zur vollständigen Bezahlung im Eigentum des Auftragnehmers. Der Auftraggeber erhält daran ein nicht ausschließliches, nicht übertragbares Nutzungsrecht für den vereinbarten Einsatzzweck.</w:t>
+      </w:r>
+    </w:p>
+    <w:p>
+      <w:pPr>
+        <w:spacing w:after="40" w:before="180"/>
+      </w:pPr>
+      <w:r>
+        <w:rPr>
+          <w:rFonts w:ascii="Arial" w:cs="Arial" w:eastAsia="Arial" w:hAnsi="Arial"/>
+          <w:b/>
+          <w:bCs/>
+          <w:color w:val="111827"/>
+          <w:sz w:val="17"/>
+          <w:szCs w:val="17"/>
+        </w:rPr>
+        <w:t xml:space="preserve">A-1.5  Loyalität</w:t>
+      </w:r>
+    </w:p>
+    <w:p>
+      <w:pPr>
+        <w:spacing w:after="70"/>
+        <w:jc w:val="both"/>
+      </w:pPr>
+      <w:r>
+        <w:rPr>
+          <w:rFonts w:ascii="Arial" w:cs="Arial" w:eastAsia="Arial" w:hAnsi="Arial"/>
+          <w:color w:val="374151"/>
+          <w:sz w:val="16"/>
+          <w:szCs w:val="16"/>
+        </w:rPr>
+        <w:t xml:space="preserve">Die Vertragspartner verpflichten sich, während der Dauer der Zusammenarbeit sowie für zwölf Monate danach keine Mitarbeiter des jeweils anderen Vertragspartners aktiv abzuwerben.</w:t>
+      </w:r>
+    </w:p>
+    <w:p>
+      <w:pPr>
+        <w:spacing w:after="40" w:before="180"/>
+      </w:pPr>
+      <w:r>
+        <w:rPr>
+          <w:rFonts w:ascii="Arial" w:cs="Arial" w:eastAsia="Arial" w:hAnsi="Arial"/>
+          <w:b/>
+          <w:bCs/>
+          <w:color w:val="111827"/>
+          <w:sz w:val="17"/>
+          <w:szCs w:val="17"/>
+        </w:rPr>
+        <w:t xml:space="preserve">A-1.6  Datenschutz und Geheimhaltung</w:t>
+      </w:r>
+    </w:p>
+    <w:p>
+      <w:pPr>
+        <w:spacing w:after="70"/>
+        <w:jc w:val="both"/>
+      </w:pPr>
+      <w:r>
+        <w:rPr>
+          <w:rFonts w:ascii="Arial" w:cs="Arial" w:eastAsia="Arial" w:hAnsi="Arial"/>
+          <w:color w:val="374151"/>
+          <w:sz w:val="16"/>
+          <w:szCs w:val="16"/>
+        </w:rPr>
+        <w:t xml:space="preserve">Die Vertragspartner behandeln alle im Rahmen der Zusammenarbeit erlangten, nicht offenkundigen Informationen vertraulich. Die Verarbeitung personenbezogener Daten erfolgt nach der DSGVO; Näheres regelt die Auftragsverarbeitungsvereinbarung in Punkt A-2.</w:t>
+      </w:r>
+    </w:p>
+    <w:p>
+      <w:pPr>
+        <w:pBdr>
+          <w:bottom w:val="single" w:color="C9A84C" w:sz="8" w:space="6"/>
+        </w:pBdr>
+        <w:spacing w:after="100" w:before="340"/>
+      </w:pPr>
+      <w:r>
+        <w:rPr>
+          <w:rFonts w:ascii="Arial" w:cs="Arial" w:eastAsia="Arial" w:hAnsi="Arial"/>
+          <w:b/>
+          <w:bCs/>
+          <w:color w:val="111827"/>
+          <w:spacing w:val="8"/>
+          <w:sz w:val="21"/>
+          <w:szCs w:val="21"/>
+        </w:rPr>
+        <w:t xml:space="preserve">A-2)  AUFTRAGSVERARBEITUNGSVEREINBARUNG</w:t>
+      </w:r>
+    </w:p>
+    <w:p>
+      <w:pPr>
+        <w:spacing w:after="70"/>
+        <w:jc w:val="both"/>
+      </w:pPr>
+      <w:r>
+        <w:rPr>
+          <w:rFonts w:ascii="Arial" w:cs="Arial" w:eastAsia="Arial" w:hAnsi="Arial"/>
+          <w:color w:val="374151"/>
+          <w:sz w:val="16"/>
+          <w:szCs w:val="16"/>
+        </w:rPr>
+        <w:t xml:space="preserve">Soweit der Auftragnehmer im Rahmen der Leistungserbringung personenbezogene Daten im Auftrag des Auftraggebers verarbeitet, gilt ergänzend die nachstehende Vereinbarung gemäß Art 28 DSGVO.</w:t>
+      </w:r>
+    </w:p>
+    <w:p>
+      <w:pPr>
+        <w:spacing w:after="40" w:before="180"/>
+      </w:pPr>
+      <w:r>
+        <w:rPr>
+          <w:rFonts w:ascii="Arial" w:cs="Arial" w:eastAsia="Arial" w:hAnsi="Arial"/>
+          <w:b/>
+          <w:bCs/>
+          <w:color w:val="111827"/>
+          <w:sz w:val="17"/>
+          <w:szCs w:val="17"/>
+        </w:rPr>
+        <w:t xml:space="preserve">A-2.1  Weisungsrecht</w:t>
+      </w:r>
+    </w:p>
+    <w:p>
+      <w:pPr>
+        <w:spacing w:after="70"/>
+        <w:jc w:val="both"/>
+      </w:pPr>
+      <w:r>
+        <w:rPr>
+          <w:rFonts w:ascii="Arial" w:cs="Arial" w:eastAsia="Arial" w:hAnsi="Arial"/>
+          <w:color w:val="374151"/>
+          <w:sz w:val="16"/>
+          <w:szCs w:val="16"/>
+        </w:rPr>
+        <w:t xml:space="preserve">Der Auftragnehmer verarbeitet personenbezogene Daten ausschließlich auf dokumentierte Weisung des Auftraggebers, es sei denn, er ist gesetzlich zur Verarbeitung verpflichtet.</w:t>
+      </w:r>
+    </w:p>
+    <w:p>
+      <w:pPr>
+        <w:spacing w:after="40" w:before="180"/>
+      </w:pPr>
+      <w:r>
+        <w:rPr>
+          <w:rFonts w:ascii="Arial" w:cs="Arial" w:eastAsia="Arial" w:hAnsi="Arial"/>
+          <w:b/>
+          <w:bCs/>
+          <w:color w:val="111827"/>
+          <w:sz w:val="17"/>
+          <w:szCs w:val="17"/>
+        </w:rPr>
+        <w:t xml:space="preserve">A-2.2  Vertraulichkeit</w:t>
+      </w:r>
+    </w:p>
+    <w:p>
+      <w:pPr>
+        <w:spacing w:after="70"/>
+        <w:jc w:val="both"/>
+      </w:pPr>
+      <w:r>
+        <w:rPr>
+          <w:rFonts w:ascii="Arial" w:cs="Arial" w:eastAsia="Arial" w:hAnsi="Arial"/>
+          <w:color w:val="374151"/>
+          <w:sz w:val="16"/>
+          <w:szCs w:val="16"/>
+        </w:rPr>
+        <w:t xml:space="preserve">Der Auftragnehmer stellt sicher, dass die zur Verarbeitung befugten Personen zur Vertraulichkeit verpflichtet sind oder einer angemessenen gesetzlichen Verschwiegenheitspflicht unterliegen.</w:t>
+      </w:r>
+    </w:p>
+    <w:p>
+      <w:pPr>
+        <w:spacing w:after="40" w:before="180"/>
+      </w:pPr>
+      <w:r>
+        <w:rPr>
+          <w:rFonts w:ascii="Arial" w:cs="Arial" w:eastAsia="Arial" w:hAnsi="Arial"/>
+          <w:b/>
+          <w:bCs/>
+          <w:color w:val="111827"/>
+          <w:sz w:val="17"/>
+          <w:szCs w:val="17"/>
+        </w:rPr>
+        <w:t xml:space="preserve">A-2.3  Datensicherheit</w:t>
+      </w:r>
+    </w:p>
+    <w:p>
+      <w:pPr>
+        <w:spacing w:after="70"/>
+        <w:jc w:val="both"/>
+      </w:pPr>
+      <w:r>
+        <w:rPr>
+          <w:rFonts w:ascii="Arial" w:cs="Arial" w:eastAsia="Arial" w:hAnsi="Arial"/>
+          <w:color w:val="374151"/>
+          <w:sz w:val="16"/>
+          <w:szCs w:val="16"/>
+        </w:rPr>
+        <w:t xml:space="preserve">Der Auftragnehmer trifft geeignete technische und organisatorische Maßnahmen gemäß Art 32 DSGVO – insbesondere Verschlüsselung, Zutritts- und Zugriffskontrolle, Datensicherung sowie Protokollierung – und passt diese dem Stand der Technik an.</w:t>
+      </w:r>
+    </w:p>
+    <w:p>
+      <w:pPr>
+        <w:spacing w:after="40" w:before="180"/>
+      </w:pPr>
+      <w:r>
+        <w:rPr>
+          <w:rFonts w:ascii="Arial" w:cs="Arial" w:eastAsia="Arial" w:hAnsi="Arial"/>
+          <w:b/>
+          <w:bCs/>
+          <w:color w:val="111827"/>
+          <w:sz w:val="17"/>
+          <w:szCs w:val="17"/>
+        </w:rPr>
+        <w:t xml:space="preserve">A-2.4  Sub-Auftragsverarbeitung</w:t>
+      </w:r>
+    </w:p>
+    <w:p>
+      <w:pPr>
+        <w:spacing w:after="70"/>
+        <w:jc w:val="both"/>
+      </w:pPr>
+      <w:r>
+        <w:rPr>
+          <w:rFonts w:ascii="Arial" w:cs="Arial" w:eastAsia="Arial" w:hAnsi="Arial"/>
+          <w:color w:val="374151"/>
+          <w:sz w:val="16"/>
+          <w:szCs w:val="16"/>
+        </w:rPr>
+        <w:t xml:space="preserve">Die Beiziehung weiterer Auftragsverarbeiter erfolgt nur mit vorheriger, allgemeiner oder gesonderter Zustimmung des Auftraggebers. Der Auftragnehmer erlegt dem Sub-Auftragsverarbeiter dieselben Datenschutzpflichten auf.</w:t>
+      </w:r>
+    </w:p>
+    <w:p>
+      <w:pPr>
+        <w:spacing w:after="40" w:before="180"/>
+      </w:pPr>
+      <w:r>
+        <w:rPr>
+          <w:rFonts w:ascii="Arial" w:cs="Arial" w:eastAsia="Arial" w:hAnsi="Arial"/>
+          <w:b/>
+          <w:bCs/>
+          <w:color w:val="111827"/>
+          <w:sz w:val="17"/>
+          <w:szCs w:val="17"/>
+        </w:rPr>
+        <w:t xml:space="preserve">A-2.5  Unterstützung</w:t>
+      </w:r>
+    </w:p>
+    <w:p>
+      <w:pPr>
+        <w:spacing w:after="70"/>
+        <w:jc w:val="both"/>
+      </w:pPr>
+      <w:r>
+        <w:rPr>
+          <w:rFonts w:ascii="Arial" w:cs="Arial" w:eastAsia="Arial" w:hAnsi="Arial"/>
+          <w:color w:val="374151"/>
+          <w:sz w:val="16"/>
+          <w:szCs w:val="16"/>
+        </w:rPr>
+        <w:t xml:space="preserve">Der Auftragnehmer unterstützt den Auftraggeber im Rahmen des Zumutbaren bei der Beantwortung von Betroffenenanfragen sowie bei der Einhaltung der Pflichten gemäß Art 32 bis 36 DSGVO (u. a. Meldung von Datenschutzverletzungen).</w:t>
+      </w:r>
+    </w:p>
+    <w:p>
+      <w:pPr>
+        <w:spacing w:after="40" w:before="180"/>
+      </w:pPr>
+      <w:r>
+        <w:rPr>
+          <w:rFonts w:ascii="Arial" w:cs="Arial" w:eastAsia="Arial" w:hAnsi="Arial"/>
+          <w:b/>
+          <w:bCs/>
+          <w:color w:val="111827"/>
+          <w:sz w:val="17"/>
+          <w:szCs w:val="17"/>
+        </w:rPr>
+        <w:t xml:space="preserve">A-2.6  Rückgabe von personenbezogenen Daten</w:t>
+      </w:r>
+    </w:p>
+    <w:p>
+      <w:pPr>
+        <w:spacing w:after="70"/>
+        <w:jc w:val="both"/>
+      </w:pPr>
+      <w:r>
+        <w:rPr>
+          <w:rFonts w:ascii="Arial" w:cs="Arial" w:eastAsia="Arial" w:hAnsi="Arial"/>
+          <w:color w:val="374151"/>
+          <w:sz w:val="16"/>
+          <w:szCs w:val="16"/>
+        </w:rPr>
+        <w:t xml:space="preserve">Nach Beendigung der Leistung werden sämtliche personenbezogenen Daten nach Wahl des Auftraggebers zurückgegeben oder gelöscht, sofern keine gesetzliche Aufbewahrungspflicht entgegensteht.</w:t>
+      </w:r>
+    </w:p>
+    <w:p>
+      <w:pPr>
+        <w:spacing w:after="40" w:before="180"/>
+      </w:pPr>
+      <w:r>
+        <w:rPr>
+          <w:rFonts w:ascii="Arial" w:cs="Arial" w:eastAsia="Arial" w:hAnsi="Arial"/>
+          <w:b/>
+          <w:bCs/>
+          <w:color w:val="111827"/>
+          <w:sz w:val="17"/>
+          <w:szCs w:val="17"/>
+        </w:rPr>
+        <w:t xml:space="preserve">A-2.7  Überprüfung</w:t>
+      </w:r>
+    </w:p>
+    <w:p>
+      <w:pPr>
+        <w:spacing w:after="70"/>
+        <w:jc w:val="both"/>
+      </w:pPr>
+      <w:r>
+        <w:rPr>
+          <w:rFonts w:ascii="Arial" w:cs="Arial" w:eastAsia="Arial" w:hAnsi="Arial"/>
+          <w:color w:val="374151"/>
+          <w:sz w:val="16"/>
+          <w:szCs w:val="16"/>
+        </w:rPr>
+        <w:t xml:space="preserve">Der Auftragnehmer stellt dem Auftraggeber alle zum Nachweis der Einhaltung erforderlichen Informationen zur Verfügung und ermöglicht angemessene Überprüfungen bzw. Audits nach vorheriger Ankündigung.</w:t>
+      </w:r>
+    </w:p>
+    <w:p>
+      <w:pPr>
+        <w:pBdr>
+          <w:bottom w:val="single" w:color="C9A84C" w:sz="8" w:space="6"/>
+        </w:pBdr>
+        <w:spacing w:after="100" w:before="340"/>
+      </w:pPr>
+      <w:r>
+        <w:rPr>
+          <w:rFonts w:ascii="Arial" w:cs="Arial" w:eastAsia="Arial" w:hAnsi="Arial"/>
+          <w:b/>
+          <w:bCs/>
+          <w:color w:val="111827"/>
+          <w:spacing w:val="8"/>
+          <w:sz w:val="21"/>
+          <w:szCs w:val="21"/>
+        </w:rPr>
+        <w:t xml:space="preserve">A-3)  ZAHLUNGSBEDINGUNGEN &amp; VERGÜTUNG</w:t>
+      </w:r>
+    </w:p>
+    <w:p>
+      <w:pPr>
+        <w:spacing w:after="40" w:before="180"/>
+      </w:pPr>
+      <w:r>
+        <w:rPr>
+          <w:rFonts w:ascii="Arial" w:cs="Arial" w:eastAsia="Arial" w:hAnsi="Arial"/>
+          <w:b/>
+          <w:bCs/>
+          <w:color w:val="111827"/>
+          <w:sz w:val="17"/>
+          <w:szCs w:val="17"/>
+        </w:rPr>
+        <w:t xml:space="preserve">A-3.1  Vergütung</w:t>
+      </w:r>
+    </w:p>
+    <w:p>
+      <w:pPr>
+        <w:spacing w:after="70"/>
+        <w:jc w:val="both"/>
+      </w:pPr>
+      <w:r>
+        <w:rPr>
+          <w:rFonts w:ascii="Arial" w:cs="Arial" w:eastAsia="Arial" w:hAnsi="Arial"/>
+          <w:color w:val="374151"/>
+          <w:sz w:val="16"/>
+          <w:szCs w:val="16"/>
+        </w:rPr>
+        <w:t xml:space="preserve">Die Vergütung richtet sich nach den in Punkt 4 des Angebots angeführten Positionen. Alle Preise verstehen sich netto in {currency} zuzüglich der gesetzlichen Umsatzsteuer. Reise-, Fahrt- und Nächtigungskosten werden, sofern nicht anders vereinbart, nach tatsächlichem Aufwand verrechnet.</w:t>
+      </w:r>
+    </w:p>
+    <w:p>
+      <w:pPr>
+        <w:spacing w:after="40" w:before="180"/>
+      </w:pPr>
+      <w:r>
+        <w:rPr>
+          <w:rFonts w:ascii="Arial" w:cs="Arial" w:eastAsia="Arial" w:hAnsi="Arial"/>
+          <w:b/>
+          <w:bCs/>
+          <w:color w:val="111827"/>
+          <w:sz w:val="17"/>
+          <w:szCs w:val="17"/>
+        </w:rPr>
+        <w:t xml:space="preserve">A-3.2  Zahlungsbedingungen</w:t>
+      </w:r>
+    </w:p>
+    <w:p>
+      <w:pPr>
+        <w:spacing w:after="70"/>
+        <w:jc w:val="both"/>
+      </w:pPr>
+      <w:r>
+        <w:rPr>
+          <w:rFonts w:ascii="Arial" w:cs="Arial" w:eastAsia="Arial" w:hAnsi="Arial"/>
+          <w:color w:val="374151"/>
+          <w:sz w:val="16"/>
+          <w:szCs w:val="16"/>
+        </w:rPr>
+        <w:t xml:space="preserve">Rechnungen sind innerhalb von {payment_terms_days} Tagen ab Rechnungserhalt ohne Abzug zur Zahlung fällig. Bei Projekten kann der Auftragnehmer Teil- oder Anzahlungsrechnungen entsprechend dem Leistungsfortschritt legen. Bei Zahlungsverzug werden Verzugszinsen in gesetzlicher Höhe (bei unternehmerischen Geschäften 9,2 Prozentpunkte über dem Basiszinssatz) sowie angemessene Mahn- und Inkassospesen verrechnet.</w:t>
+      </w:r>
+    </w:p>
+    <w:p>
+      <w:pPr>
+        <w:spacing w:after="40" w:before="180"/>
+      </w:pPr>
+      <w:r>
+        <w:rPr>
+          <w:rFonts w:ascii="Arial" w:cs="Arial" w:eastAsia="Arial" w:hAnsi="Arial"/>
+          <w:b/>
+          <w:bCs/>
+          <w:color w:val="111827"/>
+          <w:sz w:val="17"/>
+          <w:szCs w:val="17"/>
+        </w:rPr>
+        <w:t xml:space="preserve">A-3.3  Lieferung &amp; Termine</w:t>
+      </w:r>
+    </w:p>
+    <w:p>
+      <w:pPr>
+        <w:spacing w:after="70"/>
+        <w:jc w:val="both"/>
+      </w:pPr>
+      <w:r>
+        <w:rPr>
+          <w:rFonts w:ascii="Arial" w:cs="Arial" w:eastAsia="Arial" w:hAnsi="Arial"/>
+          <w:color w:val="374151"/>
+          <w:sz w:val="16"/>
+          <w:szCs w:val="16"/>
+        </w:rPr>
+        <w:t xml:space="preserve">Die Leistungserbringung beginnt nach Auftragserteilung und Klärung aller technischen Voraussetzungen. Angegebene Liefer- und Leistungstermine ({service_period}) sind, sofern nicht ausdrücklich als verbindlich (Fixtermin) bezeichnet, Richtwerte. Verzögerungen aus der Sphäre des Auftraggebers oder durch höhere Gewalt verlängern die Fristen angemessen.</w:t>
+      </w:r>
+    </w:p>
+    <w:p>
+      <w:pPr>
+        <w:spacing w:after="40" w:before="180"/>
+      </w:pPr>
+      <w:r>
+        <w:rPr>
+          <w:rFonts w:ascii="Arial" w:cs="Arial" w:eastAsia="Arial" w:hAnsi="Arial"/>
+          <w:b/>
+          <w:bCs/>
+          <w:color w:val="111827"/>
+          <w:sz w:val="17"/>
+          <w:szCs w:val="17"/>
+        </w:rPr>
+        <w:t xml:space="preserve">A-3.4  Eigentumsvorbehalt</w:t>
+      </w:r>
+    </w:p>
+    <w:p>
+      <w:pPr>
+        <w:spacing w:after="70"/>
+        <w:jc w:val="both"/>
+      </w:pPr>
+      <w:r>
+        <w:rPr>
+          <w:rFonts w:ascii="Arial" w:cs="Arial" w:eastAsia="Arial" w:hAnsi="Arial"/>
+          <w:color w:val="374151"/>
+          <w:sz w:val="16"/>
+          <w:szCs w:val="16"/>
+        </w:rPr>
+        <w:t xml:space="preserve">Gelieferte Waren bleiben bis zur vollständigen Bezahlung sämtlicher Forderungen aus der Geschäftsbeziehung im Eigentum des Auftragnehmers.</w:t>
+      </w:r>
+    </w:p>
+    <w:p>
+      <w:pPr>
+        <w:pBdr>
+          <w:bottom w:val="single" w:color="C9A84C" w:sz="8" w:space="6"/>
+        </w:pBdr>
+        <w:spacing w:after="100" w:before="340"/>
+      </w:pPr>
+      <w:r>
+        <w:rPr>
+          <w:rFonts w:ascii="Arial" w:cs="Arial" w:eastAsia="Arial" w:hAnsi="Arial"/>
+          <w:b/>
+          <w:bCs/>
+          <w:color w:val="111827"/>
+          <w:spacing w:val="8"/>
+          <w:sz w:val="21"/>
+          <w:szCs w:val="21"/>
+        </w:rPr>
+        <w:t xml:space="preserve">A-4)  GERICHTSSTAND</w:t>
+      </w:r>
+    </w:p>
+    <w:p>
+      <w:pPr>
+        <w:spacing w:after="70"/>
+        <w:jc w:val="both"/>
+      </w:pPr>
+      <w:r>
+        <w:rPr>
+          <w:rFonts w:ascii="Arial" w:cs="Arial" w:eastAsia="Arial" w:hAnsi="Arial"/>
+          <w:color w:val="374151"/>
+          <w:sz w:val="16"/>
+          <w:szCs w:val="16"/>
+        </w:rPr>
+        <w:t xml:space="preserve">Es gilt österreichisches Recht unter Ausschluss der Verweisungsnormen des internationalen Privatrechts sowie des UN-Kaufrechts. Ausschließlicher Gerichtsstand für alle Streitigkeiten aus oder im Zusammenhang mit diesem Vertrag ist das sachlich zuständige Gericht in Wien.</w:t>
+      </w:r>
+    </w:p>
+    <w:p>
+      <w:pPr>
+        <w:pBdr>
+          <w:bottom w:val="single" w:color="C9A84C" w:sz="8" w:space="6"/>
+        </w:pBdr>
+        <w:spacing w:after="100" w:before="340"/>
+      </w:pPr>
+      <w:r>
+        <w:rPr>
+          <w:rFonts w:ascii="Arial" w:cs="Arial" w:eastAsia="Arial" w:hAnsi="Arial"/>
+          <w:b/>
+          <w:bCs/>
+          <w:color w:val="111827"/>
+          <w:spacing w:val="8"/>
+          <w:sz w:val="21"/>
+          <w:szCs w:val="21"/>
+        </w:rPr>
+        <w:t xml:space="preserve">A-5)  SCHLUSSBESTIMMUNGEN</w:t>
+      </w:r>
+    </w:p>
+    <w:p>
+      <w:pPr>
+        <w:spacing w:after="70"/>
+        <w:jc w:val="both"/>
+      </w:pPr>
+      <w:r>
+        <w:rPr>
+          <w:rFonts w:ascii="Arial" w:cs="Arial" w:eastAsia="Arial" w:hAnsi="Arial"/>
+          <w:color w:val="374151"/>
+          <w:sz w:val="16"/>
+          <w:szCs w:val="16"/>
+        </w:rPr>
+        <w:t xml:space="preserve">Änderungen und Ergänzungen bedürfen der Schriftform; dies gilt auch für ein Abgehen vom Schriftformerfordernis. Sollten einzelne Bestimmungen unwirksam sein oder werden, bleibt die Wirksamkeit der übrigen Bestimmungen unberührt (salvatorische Klausel); an die Stelle der unwirksamen Bestimmung tritt eine dem wirtschaftlichen Zweck möglichst nahekommende Regelung.</w:t>
+      </w:r>
+    </w:p>
     <w:p>
       <w:pPr>
         <w:spacing w:after="100" w:before="360"/>

</xml_diff>